<commit_message>
Update analyst status management, dashboard layout, and manager profile
</commit_message>
<xml_diff>
--- a/Sem 4 Docs/Project Documentation Sem 4.docx
+++ b/Sem 4 Docs/Project Documentation Sem 4.docx
@@ -1397,7 +1397,16 @@
                                   <w:sz w:val="26"/>
                                   <w:szCs w:val="26"/>
                                 </w:rPr>
-                                <w:t>MASTERS IN COMPUTER MANAGEMENT</w:t>
+                                <w:t xml:space="preserve">MASTERS IN COMPUTER </w:t>
+                              </w:r>
+                              <w:r>
+                                <w:rPr>
+                                  <w:rFonts w:ascii="Times New Roman" w:eastAsia="Times New Roman" w:hAnsi="Times New Roman" w:cs="Times New Roman"/>
+                                  <w:b/>
+                                  <w:sz w:val="26"/>
+                                  <w:szCs w:val="26"/>
+                                </w:rPr>
+                                <w:t>APPLICATION</w:t>
                               </w:r>
                             </w:p>
                           </w:txbxContent>
@@ -2601,7 +2610,16 @@
                             <w:sz w:val="26"/>
                             <w:szCs w:val="26"/>
                           </w:rPr>
-                          <w:t>MASTERS IN COMPUTER MANAGEMENT</w:t>
+                          <w:t xml:space="preserve">MASTERS IN COMPUTER </w:t>
+                        </w:r>
+                        <w:r>
+                          <w:rPr>
+                            <w:rFonts w:ascii="Times New Roman" w:eastAsia="Times New Roman" w:hAnsi="Times New Roman" w:cs="Times New Roman"/>
+                            <w:b/>
+                            <w:sz w:val="26"/>
+                            <w:szCs w:val="26"/>
+                          </w:rPr>
+                          <w:t>APPLICATION</w:t>
                         </w:r>
                       </w:p>
                     </w:txbxContent>
@@ -2884,6 +2902,9 @@
     </w:p>
     <w:p>
       <w:r>
+        <w:rPr>
+          <w:noProof/>
+        </w:rPr>
         <w:lastRenderedPageBreak/>
         <w:drawing>
           <wp:inline distT="0" distB="0" distL="0" distR="0" wp14:anchorId="35BEFE8A" wp14:editId="5363FE97">
@@ -2927,6 +2948,9 @@
     </w:p>
     <w:p>
       <w:r>
+        <w:rPr>
+          <w:noProof/>
+        </w:rPr>
         <w:lastRenderedPageBreak/>
         <w:drawing>
           <wp:inline distT="0" distB="0" distL="0" distR="0" wp14:anchorId="23CC8243" wp14:editId="68FD339A">
@@ -2974,10 +2998,10 @@
       <w:r>
         <w:lastRenderedPageBreak/>
         <w:drawing>
-          <wp:inline distT="0" distB="0" distL="0" distR="0" wp14:anchorId="4A68C881" wp14:editId="2FB50552">
-            <wp:extent cx="6212273" cy="8122920"/>
-            <wp:effectExtent l="0" t="0" r="0" b="0"/>
-            <wp:docPr id="9" name="Picture 9"/>
+          <wp:inline distT="0" distB="0" distL="0" distR="0" wp14:anchorId="5013342B" wp14:editId="6E9D33A1">
+            <wp:extent cx="6120130" cy="8716645"/>
+            <wp:effectExtent l="0" t="0" r="0" b="8255"/>
+            <wp:docPr id="5" name="Picture 5"/>
             <wp:cNvGraphicFramePr>
               <a:graphicFrameLocks xmlns:a="http://schemas.openxmlformats.org/drawingml/2006/main" noChangeAspect="1"/>
             </wp:cNvGraphicFramePr>
@@ -2997,7 +3021,7 @@
                   <pic:spPr>
                     <a:xfrm>
                       <a:off x="0" y="0"/>
-                      <a:ext cx="6220946" cy="8134261"/>
+                      <a:ext cx="6120130" cy="8716645"/>
                     </a:xfrm>
                     <a:prstGeom prst="rect">
                       <a:avLst/>
@@ -3010,26 +3034,6 @@
         </w:drawing>
       </w:r>
     </w:p>
-    <w:bookmarkStart w:id="0" w:name="_MON_1839763812"/>
-    <w:bookmarkEnd w:id="0"/>
-    <w:p>
-      <w:r>
-        <w:rPr>
-          <w:rFonts w:ascii="Times New Roman" w:hAnsi="Times New Roman" w:cs="Times New Roman"/>
-          <w:b/>
-          <w:sz w:val="26"/>
-          <w:szCs w:val="26"/>
-        </w:rPr>
-        <w:object w:dxaOrig="10663" w:dyaOrig="589">
-          <v:shape id="_x0000_i1025" type="#_x0000_t75" style="width:533.4pt;height:29.4pt" o:ole="">
-            <v:imagedata r:id="rId15" o:title=""/>
-          </v:shape>
-          <o:OLEObject Type="Embed" ProgID="Word.Document.12" ShapeID="_x0000_i1025" DrawAspect="Content" ObjectID="_1839781387" r:id="rId16">
-            <o:FieldCodes>\s</o:FieldCodes>
-          </o:OLEObject>
-        </w:object>
-      </w:r>
-    </w:p>
     <w:p>
       <w:pPr>
         <w:spacing w:before="40" w:after="40"/>
@@ -3067,6 +3071,174 @@
         <w:spacing w:before="40" w:after="40"/>
         <w:rPr>
           <w:rFonts w:ascii="Times New Roman" w:hAnsi="Times New Roman" w:cs="Times New Roman"/>
+          <w:sz w:val="26"/>
+          <w:szCs w:val="26"/>
+        </w:rPr>
+      </w:pPr>
+      <w:r>
+        <w:rPr>
+          <w:rFonts w:ascii="Times New Roman" w:hAnsi="Times New Roman" w:cs="Times New Roman"/>
+          <w:sz w:val="26"/>
+          <w:szCs w:val="26"/>
+        </w:rPr>
+        <w:t>I would like to express my deepest gratitude and appreciation to all those who have contributed to the successful completion of this project, "Sentinel Alert Triage Hub." This project has been a significant milestone in my academic journey, providing me with an opportunity to explore the intersection of Cybersecurity and Artificial Intelligence.</w:t>
+      </w:r>
+    </w:p>
+    <w:p>
+      <w:pPr>
+        <w:spacing w:before="40" w:after="40"/>
+        <w:rPr>
+          <w:rFonts w:ascii="Times New Roman" w:hAnsi="Times New Roman" w:cs="Times New Roman"/>
+          <w:sz w:val="26"/>
+          <w:szCs w:val="26"/>
+        </w:rPr>
+      </w:pPr>
+    </w:p>
+    <w:p>
+      <w:pPr>
+        <w:spacing w:before="40" w:after="40"/>
+        <w:rPr>
+          <w:rFonts w:ascii="Times New Roman" w:hAnsi="Times New Roman" w:cs="Times New Roman"/>
+          <w:sz w:val="26"/>
+          <w:szCs w:val="26"/>
+        </w:rPr>
+      </w:pPr>
+      <w:r>
+        <w:rPr>
+          <w:rFonts w:ascii="Times New Roman" w:hAnsi="Times New Roman" w:cs="Times New Roman"/>
+          <w:sz w:val="26"/>
+          <w:szCs w:val="26"/>
+        </w:rPr>
+        <w:t>First and foremost, I would like to express my sincere thanks to my project guide, Mr. Mukul Kulkarni, for their invaluable guidance, constant encouragement, and insightful suggestions throughout the development of this project. Their expertise in the field of cybersecurity and software engineering was instrumental in shaping the architecture and technical direction of the Sentinel Hub.</w:t>
+      </w:r>
+    </w:p>
+    <w:p>
+      <w:pPr>
+        <w:spacing w:before="40" w:after="40"/>
+        <w:rPr>
+          <w:rFonts w:ascii="Times New Roman" w:hAnsi="Times New Roman" w:cs="Times New Roman"/>
+          <w:sz w:val="26"/>
+          <w:szCs w:val="26"/>
+        </w:rPr>
+      </w:pPr>
+    </w:p>
+    <w:p>
+      <w:pPr>
+        <w:spacing w:before="40" w:after="40"/>
+        <w:rPr>
+          <w:rFonts w:ascii="Times New Roman" w:hAnsi="Times New Roman" w:cs="Times New Roman"/>
+          <w:sz w:val="26"/>
+          <w:szCs w:val="26"/>
+        </w:rPr>
+      </w:pPr>
+      <w:r>
+        <w:rPr>
+          <w:rFonts w:ascii="Times New Roman" w:hAnsi="Times New Roman" w:cs="Times New Roman"/>
+          <w:sz w:val="26"/>
+          <w:szCs w:val="26"/>
+        </w:rPr>
+        <w:t>I am also deeply grateful to Mr. Ravikant Zirmite , Head of the Department of MCA, for providing the necessary facilities and a conducive environment for research and development.</w:t>
+      </w:r>
+    </w:p>
+    <w:p>
+      <w:pPr>
+        <w:spacing w:before="40" w:after="40"/>
+        <w:rPr>
+          <w:rFonts w:ascii="Times New Roman" w:hAnsi="Times New Roman" w:cs="Times New Roman"/>
+          <w:sz w:val="26"/>
+          <w:szCs w:val="26"/>
+        </w:rPr>
+      </w:pPr>
+    </w:p>
+    <w:p>
+      <w:pPr>
+        <w:spacing w:before="40" w:after="40"/>
+        <w:rPr>
+          <w:rFonts w:ascii="Times New Roman" w:hAnsi="Times New Roman" w:cs="Times New Roman"/>
+          <w:sz w:val="26"/>
+          <w:szCs w:val="26"/>
+        </w:rPr>
+      </w:pPr>
+      <w:r>
+        <w:rPr>
+          <w:rFonts w:ascii="Times New Roman" w:hAnsi="Times New Roman" w:cs="Times New Roman"/>
+          <w:sz w:val="26"/>
+          <w:szCs w:val="26"/>
+        </w:rPr>
+        <w:t>My heartfelt thanks go to the faculty members of MES IMCC College, Pune for their academic support and for equipping me with the foundational knowledge required to tackle complex real-world problems.</w:t>
+      </w:r>
+    </w:p>
+    <w:p>
+      <w:pPr>
+        <w:spacing w:before="40" w:after="40"/>
+        <w:rPr>
+          <w:rFonts w:ascii="Times New Roman" w:hAnsi="Times New Roman" w:cs="Times New Roman"/>
+          <w:sz w:val="26"/>
+          <w:szCs w:val="26"/>
+        </w:rPr>
+      </w:pPr>
+    </w:p>
+    <w:p>
+      <w:pPr>
+        <w:spacing w:before="40" w:after="40"/>
+        <w:rPr>
+          <w:rFonts w:ascii="Times New Roman" w:hAnsi="Times New Roman" w:cs="Times New Roman"/>
+          <w:sz w:val="26"/>
+          <w:szCs w:val="26"/>
+        </w:rPr>
+      </w:pPr>
+      <w:r>
+        <w:rPr>
+          <w:rFonts w:ascii="Times New Roman" w:hAnsi="Times New Roman" w:cs="Times New Roman"/>
+          <w:sz w:val="26"/>
+          <w:szCs w:val="26"/>
+        </w:rPr>
+        <w:t>I would also like to acknowledge the research community and the authors of the various research papers—including those by Veeramachaneni et al., Deng et al., and Xiong &amp; Lagerström—whose work on AI-augmented triage, LLM reasoning, and explainable security systems provided the theoretical framework for this implementation.</w:t>
+      </w:r>
+    </w:p>
+    <w:p>
+      <w:pPr>
+        <w:spacing w:before="40" w:after="40"/>
+        <w:rPr>
+          <w:rFonts w:ascii="Times New Roman" w:hAnsi="Times New Roman" w:cs="Times New Roman"/>
+          <w:sz w:val="26"/>
+          <w:szCs w:val="26"/>
+        </w:rPr>
+      </w:pPr>
+    </w:p>
+    <w:p>
+      <w:pPr>
+        <w:spacing w:before="40" w:after="40"/>
+        <w:rPr>
+          <w:rFonts w:ascii="Times New Roman" w:hAnsi="Times New Roman" w:cs="Times New Roman"/>
+          <w:sz w:val="26"/>
+          <w:szCs w:val="26"/>
+        </w:rPr>
+      </w:pPr>
+      <w:r>
+        <w:rPr>
+          <w:rFonts w:ascii="Times New Roman" w:hAnsi="Times New Roman" w:cs="Times New Roman"/>
+          <w:sz w:val="26"/>
+          <w:szCs w:val="26"/>
+        </w:rPr>
+        <w:t>Finally, I am indebted to my family and friends for their unwavering support, patience, and motivation during the many hours spent coding and documenting this project. Their belief in my abilities has been a constant source of strength.</w:t>
+      </w:r>
+    </w:p>
+    <w:p>
+      <w:pPr>
+        <w:spacing w:before="40" w:after="40"/>
+        <w:rPr>
+          <w:rFonts w:ascii="Times New Roman" w:hAnsi="Times New Roman" w:cs="Times New Roman"/>
+          <w:sz w:val="26"/>
+          <w:szCs w:val="26"/>
+        </w:rPr>
+      </w:pPr>
+    </w:p>
+    <w:p>
+      <w:pPr>
+        <w:spacing w:before="40" w:after="40"/>
+        <w:rPr>
+          <w:rFonts w:ascii="Times New Roman" w:hAnsi="Times New Roman" w:cs="Times New Roman"/>
           <w:b/>
           <w:sz w:val="26"/>
           <w:szCs w:val="26"/>
@@ -3079,7 +3251,7 @@
           <w:sz w:val="26"/>
           <w:szCs w:val="26"/>
         </w:rPr>
-        <w:t>I would like to express my deepest gratitude and appreciation to all those who have contributed to the successful completion of this project, "Sentinel Alert Triage Hub." This project has been a significant milestone in my academic journey, providing me with an opportunity to explore the intersection of Cybersecurity and Artificial Intelligence.</w:t>
+        <w:t>Manas Dhananjay Beke</w:t>
       </w:r>
     </w:p>
     <w:p>
@@ -3092,6 +3264,33 @@
           <w:szCs w:val="26"/>
         </w:rPr>
       </w:pPr>
+      <w:r>
+        <w:rPr>
+          <w:rFonts w:ascii="Times New Roman" w:hAnsi="Times New Roman" w:cs="Times New Roman"/>
+          <w:b/>
+          <w:sz w:val="26"/>
+          <w:szCs w:val="26"/>
+        </w:rPr>
+        <w:t>Roll No:</w:t>
+      </w:r>
+      <w:r>
+        <w:rPr>
+          <w:rFonts w:ascii="Times New Roman" w:hAnsi="Times New Roman" w:cs="Times New Roman"/>
+          <w:b/>
+          <w:sz w:val="26"/>
+          <w:szCs w:val="26"/>
+        </w:rPr>
+        <w:t>2401010</w:t>
+      </w:r>
+      <w:r>
+        <w:rPr>
+          <w:rFonts w:ascii="Times New Roman" w:hAnsi="Times New Roman" w:cs="Times New Roman"/>
+          <w:b/>
+          <w:sz w:val="26"/>
+          <w:szCs w:val="26"/>
+        </w:rPr>
+        <w:t xml:space="preserve"> </w:t>
+      </w:r>
     </w:p>
     <w:p>
       <w:pPr>
@@ -3110,7 +3309,7 @@
           <w:sz w:val="26"/>
           <w:szCs w:val="26"/>
         </w:rPr>
-        <w:t xml:space="preserve">First and foremost, I would like to express my sincere thanks to my project guide, </w:t>
+        <w:t>Department of</w:t>
       </w:r>
       <w:r>
         <w:rPr>
@@ -3119,7 +3318,7 @@
           <w:sz w:val="26"/>
           <w:szCs w:val="26"/>
         </w:rPr>
-        <w:t>Mr. Mukul Kulkarni</w:t>
+        <w:t xml:space="preserve"> MCA</w:t>
       </w:r>
       <w:r>
         <w:rPr>
@@ -3128,7 +3327,7 @@
           <w:sz w:val="26"/>
           <w:szCs w:val="26"/>
         </w:rPr>
-        <w:t>, for their invaluable guidance, constant encouragement, and insightful suggestions throughout the development of this project. Their expertise in the field of cybersecurity and software engineering was instrumental in shaping the architecture and technical direction of the Sentinel Hub.</w:t>
+        <w:t xml:space="preserve"> </w:t>
       </w:r>
     </w:p>
     <w:p>
@@ -3141,6 +3340,15 @@
           <w:szCs w:val="26"/>
         </w:rPr>
       </w:pPr>
+      <w:r>
+        <w:rPr>
+          <w:rFonts w:ascii="Times New Roman" w:hAnsi="Times New Roman" w:cs="Times New Roman"/>
+          <w:b/>
+          <w:sz w:val="26"/>
+          <w:szCs w:val="26"/>
+        </w:rPr>
+        <w:t>MES IMCC College, Pune</w:t>
+      </w:r>
     </w:p>
     <w:p>
       <w:pPr>
@@ -3159,7 +3367,7 @@
           <w:sz w:val="26"/>
           <w:szCs w:val="26"/>
         </w:rPr>
-        <w:t>I am also deeply grateful to</w:t>
+        <w:t>Date: May 05, 2026</w:t>
       </w:r>
       <w:r>
         <w:rPr>
@@ -3168,314 +3376,24 @@
           <w:sz w:val="26"/>
           <w:szCs w:val="26"/>
         </w:rPr>
-        <w:t xml:space="preserve"> Mr. Ravikant Zirmite </w:t>
-      </w:r>
-      <w:r>
+        <w:br w:type="page"/>
+      </w:r>
+    </w:p>
+    <w:p>
+      <w:pPr>
         <w:rPr>
           <w:rFonts w:ascii="Times New Roman" w:hAnsi="Times New Roman" w:cs="Times New Roman"/>
           <w:b/>
           <w:sz w:val="26"/>
           <w:szCs w:val="26"/>
         </w:rPr>
-        <w:t>, Head of the Department of</w:t>
-      </w:r>
-      <w:r>
-        <w:rPr>
-          <w:rFonts w:ascii="Times New Roman" w:hAnsi="Times New Roman" w:cs="Times New Roman"/>
-          <w:b/>
-          <w:sz w:val="26"/>
-          <w:szCs w:val="26"/>
-        </w:rPr>
-        <w:t xml:space="preserve"> MCA</w:t>
-      </w:r>
-      <w:r>
-        <w:rPr>
-          <w:rFonts w:ascii="Times New Roman" w:hAnsi="Times New Roman" w:cs="Times New Roman"/>
-          <w:b/>
-          <w:sz w:val="26"/>
-          <w:szCs w:val="26"/>
-        </w:rPr>
-        <w:t>, for providing the necessary facilities and a conducive environment for research and development.</w:t>
-      </w:r>
-    </w:p>
-    <w:p>
-      <w:pPr>
-        <w:spacing w:before="40" w:after="40"/>
-        <w:rPr>
-          <w:rFonts w:ascii="Times New Roman" w:hAnsi="Times New Roman" w:cs="Times New Roman"/>
-          <w:b/>
-          <w:sz w:val="26"/>
-          <w:szCs w:val="26"/>
-        </w:rPr>
-      </w:pPr>
-    </w:p>
-    <w:p>
-      <w:pPr>
-        <w:spacing w:before="40" w:after="40"/>
-        <w:rPr>
-          <w:rFonts w:ascii="Times New Roman" w:hAnsi="Times New Roman" w:cs="Times New Roman"/>
-          <w:b/>
-          <w:sz w:val="26"/>
-          <w:szCs w:val="26"/>
-        </w:rPr>
-      </w:pPr>
-      <w:r>
-        <w:rPr>
-          <w:rFonts w:ascii="Times New Roman" w:hAnsi="Times New Roman" w:cs="Times New Roman"/>
-          <w:b/>
-          <w:sz w:val="26"/>
-          <w:szCs w:val="26"/>
-        </w:rPr>
-        <w:t xml:space="preserve">My heartfelt thanks go to the faculty members of </w:t>
-      </w:r>
-      <w:r>
-        <w:rPr>
-          <w:rFonts w:ascii="Times New Roman" w:hAnsi="Times New Roman" w:cs="Times New Roman"/>
-          <w:b/>
-          <w:sz w:val="26"/>
-          <w:szCs w:val="26"/>
-        </w:rPr>
-        <w:t xml:space="preserve">MES IMCC College, Pune </w:t>
-      </w:r>
-      <w:r>
-        <w:rPr>
-          <w:rFonts w:ascii="Times New Roman" w:hAnsi="Times New Roman" w:cs="Times New Roman"/>
-          <w:b/>
-          <w:sz w:val="26"/>
-          <w:szCs w:val="26"/>
-        </w:rPr>
-        <w:t>for their academic support and for equipping me with the foundational knowledge required to tackle complex real-world problems.</w:t>
-      </w:r>
-    </w:p>
-    <w:p>
-      <w:pPr>
-        <w:spacing w:before="40" w:after="40"/>
-        <w:rPr>
-          <w:rFonts w:ascii="Times New Roman" w:hAnsi="Times New Roman" w:cs="Times New Roman"/>
-          <w:b/>
-          <w:sz w:val="26"/>
-          <w:szCs w:val="26"/>
-        </w:rPr>
-      </w:pPr>
-    </w:p>
-    <w:p>
-      <w:pPr>
-        <w:spacing w:before="40" w:after="40"/>
-        <w:rPr>
-          <w:rFonts w:ascii="Times New Roman" w:hAnsi="Times New Roman" w:cs="Times New Roman"/>
-          <w:b/>
-          <w:sz w:val="26"/>
-          <w:szCs w:val="26"/>
-        </w:rPr>
-      </w:pPr>
-      <w:r>
-        <w:rPr>
-          <w:rFonts w:ascii="Times New Roman" w:hAnsi="Times New Roman" w:cs="Times New Roman"/>
-          <w:b/>
-          <w:sz w:val="26"/>
-          <w:szCs w:val="26"/>
-        </w:rPr>
-        <w:t>I would also like to acknowledge the research community and the authors of the various research papers—including those by Veeramachaneni et al., Deng et al., and Xiong &amp; Lagerström—whose work on AI-augmented triage, LLM reasoning, and explainable security systems provided the theoretical framework for this implementation.</w:t>
-      </w:r>
-    </w:p>
-    <w:p>
-      <w:pPr>
-        <w:spacing w:before="40" w:after="40"/>
-        <w:rPr>
-          <w:rFonts w:ascii="Times New Roman" w:hAnsi="Times New Roman" w:cs="Times New Roman"/>
-          <w:b/>
-          <w:sz w:val="26"/>
-          <w:szCs w:val="26"/>
-        </w:rPr>
-      </w:pPr>
-    </w:p>
-    <w:p>
-      <w:pPr>
-        <w:spacing w:before="40" w:after="40"/>
-        <w:rPr>
-          <w:rFonts w:ascii="Times New Roman" w:hAnsi="Times New Roman" w:cs="Times New Roman"/>
-          <w:b/>
-          <w:sz w:val="26"/>
-          <w:szCs w:val="26"/>
-        </w:rPr>
-      </w:pPr>
-      <w:r>
-        <w:rPr>
-          <w:rFonts w:ascii="Times New Roman" w:hAnsi="Times New Roman" w:cs="Times New Roman"/>
-          <w:b/>
-          <w:sz w:val="26"/>
-          <w:szCs w:val="26"/>
-        </w:rPr>
-        <w:t>Finally, I am indebted to my family and friends for their unwavering support, patience, and motivation during the many hours spent coding and documenting this project. Their belief in my abilities has been a constant source of strength.</w:t>
-      </w:r>
-    </w:p>
-    <w:p>
-      <w:pPr>
-        <w:spacing w:before="40" w:after="40"/>
-        <w:rPr>
-          <w:rFonts w:ascii="Times New Roman" w:hAnsi="Times New Roman" w:cs="Times New Roman"/>
-          <w:b/>
-          <w:sz w:val="26"/>
-          <w:szCs w:val="26"/>
-        </w:rPr>
-      </w:pPr>
-    </w:p>
-    <w:p>
-      <w:pPr>
-        <w:spacing w:before="40" w:after="40"/>
-        <w:rPr>
-          <w:rFonts w:ascii="Times New Roman" w:hAnsi="Times New Roman" w:cs="Times New Roman"/>
-          <w:b/>
-          <w:sz w:val="26"/>
-          <w:szCs w:val="26"/>
-        </w:rPr>
-      </w:pPr>
-      <w:r>
-        <w:rPr>
-          <w:rFonts w:ascii="Times New Roman" w:hAnsi="Times New Roman" w:cs="Times New Roman"/>
-          <w:b/>
-          <w:sz w:val="26"/>
-          <w:szCs w:val="26"/>
-        </w:rPr>
-        <w:t>Manas Dhananjay Beke</w:t>
-      </w:r>
-    </w:p>
-    <w:p>
-      <w:pPr>
-        <w:spacing w:before="40" w:after="40"/>
-        <w:rPr>
-          <w:rFonts w:ascii="Times New Roman" w:hAnsi="Times New Roman" w:cs="Times New Roman"/>
-          <w:b/>
-          <w:sz w:val="26"/>
-          <w:szCs w:val="26"/>
-        </w:rPr>
-      </w:pPr>
-      <w:r>
-        <w:rPr>
-          <w:rFonts w:ascii="Times New Roman" w:hAnsi="Times New Roman" w:cs="Times New Roman"/>
-          <w:b/>
-          <w:sz w:val="26"/>
-          <w:szCs w:val="26"/>
-        </w:rPr>
-        <w:t>Roll No:</w:t>
-      </w:r>
-      <w:r>
-        <w:rPr>
-          <w:rFonts w:ascii="Times New Roman" w:hAnsi="Times New Roman" w:cs="Times New Roman"/>
-          <w:b/>
-          <w:sz w:val="26"/>
-          <w:szCs w:val="26"/>
-        </w:rPr>
-        <w:t>2401010</w:t>
-      </w:r>
-      <w:r>
-        <w:rPr>
-          <w:rFonts w:ascii="Times New Roman" w:hAnsi="Times New Roman" w:cs="Times New Roman"/>
-          <w:b/>
-          <w:sz w:val="26"/>
-          <w:szCs w:val="26"/>
-        </w:rPr>
-        <w:t xml:space="preserve"> </w:t>
-      </w:r>
-    </w:p>
-    <w:p>
-      <w:pPr>
-        <w:spacing w:before="40" w:after="40"/>
-        <w:rPr>
-          <w:rFonts w:ascii="Times New Roman" w:hAnsi="Times New Roman" w:cs="Times New Roman"/>
-          <w:b/>
-          <w:sz w:val="26"/>
-          <w:szCs w:val="26"/>
-        </w:rPr>
-      </w:pPr>
-      <w:r>
-        <w:rPr>
-          <w:rFonts w:ascii="Times New Roman" w:hAnsi="Times New Roman" w:cs="Times New Roman"/>
-          <w:b/>
-          <w:sz w:val="26"/>
-          <w:szCs w:val="26"/>
-        </w:rPr>
-        <w:t>Department of</w:t>
-      </w:r>
-      <w:r>
-        <w:rPr>
-          <w:rFonts w:ascii="Times New Roman" w:hAnsi="Times New Roman" w:cs="Times New Roman"/>
-          <w:b/>
-          <w:sz w:val="26"/>
-          <w:szCs w:val="26"/>
-        </w:rPr>
-        <w:t xml:space="preserve"> MCA</w:t>
-      </w:r>
-      <w:r>
-        <w:rPr>
-          <w:rFonts w:ascii="Times New Roman" w:hAnsi="Times New Roman" w:cs="Times New Roman"/>
-          <w:b/>
-          <w:sz w:val="26"/>
-          <w:szCs w:val="26"/>
-        </w:rPr>
-        <w:t xml:space="preserve"> </w:t>
-      </w:r>
-    </w:p>
-    <w:p>
-      <w:pPr>
-        <w:spacing w:before="40" w:after="40"/>
-        <w:rPr>
-          <w:rFonts w:ascii="Times New Roman" w:hAnsi="Times New Roman" w:cs="Times New Roman"/>
-          <w:b/>
-          <w:sz w:val="26"/>
-          <w:szCs w:val="26"/>
-        </w:rPr>
-      </w:pPr>
-      <w:r>
-        <w:rPr>
-          <w:rFonts w:ascii="Times New Roman" w:hAnsi="Times New Roman" w:cs="Times New Roman"/>
-          <w:b/>
-          <w:sz w:val="26"/>
-          <w:szCs w:val="26"/>
-        </w:rPr>
-        <w:t>MES IMCC College, Pune</w:t>
-      </w:r>
-    </w:p>
-    <w:p>
-      <w:pPr>
-        <w:spacing w:before="40" w:after="40"/>
-        <w:rPr>
-          <w:rFonts w:ascii="Times New Roman" w:hAnsi="Times New Roman" w:cs="Times New Roman"/>
-          <w:b/>
-          <w:sz w:val="26"/>
-          <w:szCs w:val="26"/>
-        </w:rPr>
-      </w:pPr>
-      <w:r>
-        <w:rPr>
-          <w:rFonts w:ascii="Times New Roman" w:hAnsi="Times New Roman" w:cs="Times New Roman"/>
-          <w:b/>
-          <w:sz w:val="26"/>
-          <w:szCs w:val="26"/>
-        </w:rPr>
-        <w:t>Date: May 05, 2026</w:t>
-      </w:r>
-      <w:r>
-        <w:rPr>
-          <w:rFonts w:ascii="Times New Roman" w:hAnsi="Times New Roman" w:cs="Times New Roman"/>
-          <w:b/>
-          <w:sz w:val="26"/>
-          <w:szCs w:val="26"/>
-        </w:rPr>
-        <w:br w:type="page"/>
-      </w:r>
-    </w:p>
-    <w:p>
-      <w:pPr>
-        <w:rPr>
-          <w:rFonts w:ascii="Times New Roman" w:hAnsi="Times New Roman" w:cs="Times New Roman"/>
-          <w:b/>
-          <w:sz w:val="26"/>
-          <w:szCs w:val="26"/>
-        </w:rPr>
         <w:sectPr>
-          <w:footerReference w:type="default" r:id="rId17"/>
-          <w:footerReference w:type="first" r:id="rId18"/>
+          <w:headerReference w:type="even" r:id="rId15"/>
+          <w:headerReference w:type="default" r:id="rId16"/>
+          <w:footerReference w:type="even" r:id="rId17"/>
+          <w:footerReference w:type="default" r:id="rId18"/>
+          <w:headerReference w:type="first" r:id="rId19"/>
+          <w:footerReference w:type="first" r:id="rId20"/>
           <w:pgSz w:w="11906" w:h="16838" w:code="9"/>
           <w:pgMar w:top="1440" w:right="567" w:bottom="1440" w:left="1701" w:header="709" w:footer="709" w:gutter="0"/>
           <w:cols w:space="708"/>
@@ -3511,9 +3429,9 @@
         <w:tblLook w:val="04A0" w:firstRow="1" w:lastRow="0" w:firstColumn="1" w:lastColumn="0" w:noHBand="0" w:noVBand="1"/>
       </w:tblPr>
       <w:tblGrid>
-        <w:gridCol w:w="1250"/>
+        <w:gridCol w:w="1314"/>
         <w:gridCol w:w="7087"/>
-        <w:gridCol w:w="1623"/>
+        <w:gridCol w:w="1559"/>
       </w:tblGrid>
       <w:tr>
         <w:trPr>
@@ -3530,6 +3448,8 @@
                 <w:rFonts w:ascii="Times New Roman" w:eastAsia="Times New Roman" w:hAnsi="Times New Roman" w:cs="Times New Roman"/>
                 <w:color w:val="1F1F1F"/>
                 <w:kern w:val="0"/>
+                <w:sz w:val="26"/>
+                <w:szCs w:val="26"/>
                 <w:lang w:eastAsia="en-IN"/>
                 <w14:ligatures w14:val="none"/>
               </w:rPr>
@@ -3541,6 +3461,8 @@
                 <w:bCs/>
                 <w:color w:val="1F1F1F"/>
                 <w:kern w:val="0"/>
+                <w:sz w:val="26"/>
+                <w:szCs w:val="26"/>
                 <w:bdr w:val="none" w:sz="0" w:space="0" w:color="auto" w:frame="1"/>
                 <w:lang w:eastAsia="en-IN"/>
                 <w14:ligatures w14:val="none"/>
@@ -3560,6 +3482,8 @@
                 <w:rFonts w:ascii="Times New Roman" w:eastAsia="Times New Roman" w:hAnsi="Times New Roman" w:cs="Times New Roman"/>
                 <w:color w:val="1F1F1F"/>
                 <w:kern w:val="0"/>
+                <w:sz w:val="26"/>
+                <w:szCs w:val="26"/>
                 <w:lang w:eastAsia="en-IN"/>
                 <w14:ligatures w14:val="none"/>
               </w:rPr>
@@ -3571,6 +3495,8 @@
                 <w:bCs/>
                 <w:color w:val="1F1F1F"/>
                 <w:kern w:val="0"/>
+                <w:sz w:val="26"/>
+                <w:szCs w:val="26"/>
                 <w:bdr w:val="none" w:sz="0" w:space="0" w:color="auto" w:frame="1"/>
                 <w:lang w:eastAsia="en-IN"/>
                 <w14:ligatures w14:val="none"/>
@@ -3625,6 +3551,8 @@
                 <w:rFonts w:ascii="Times New Roman" w:eastAsia="Times New Roman" w:hAnsi="Times New Roman" w:cs="Times New Roman"/>
                 <w:color w:val="1F1F1F"/>
                 <w:kern w:val="0"/>
+                <w:sz w:val="26"/>
+                <w:szCs w:val="26"/>
                 <w:lang w:eastAsia="en-IN"/>
                 <w14:ligatures w14:val="none"/>
               </w:rPr>
@@ -3636,6 +3564,8 @@
                 <w:bCs/>
                 <w:color w:val="1F1F1F"/>
                 <w:kern w:val="0"/>
+                <w:sz w:val="26"/>
+                <w:szCs w:val="26"/>
                 <w:bdr w:val="none" w:sz="0" w:space="0" w:color="auto" w:frame="1"/>
                 <w:lang w:eastAsia="en-IN"/>
                 <w14:ligatures w14:val="none"/>
@@ -3655,6 +3585,8 @@
                 <w:rFonts w:ascii="Times New Roman" w:eastAsia="Times New Roman" w:hAnsi="Times New Roman" w:cs="Times New Roman"/>
                 <w:color w:val="1F1F1F"/>
                 <w:kern w:val="0"/>
+                <w:sz w:val="26"/>
+                <w:szCs w:val="26"/>
                 <w:lang w:eastAsia="en-IN"/>
                 <w14:ligatures w14:val="none"/>
               </w:rPr>
@@ -3666,6 +3598,8 @@
                 <w:bCs/>
                 <w:color w:val="1F1F1F"/>
                 <w:kern w:val="0"/>
+                <w:sz w:val="26"/>
+                <w:szCs w:val="26"/>
                 <w:bdr w:val="none" w:sz="0" w:space="0" w:color="auto" w:frame="1"/>
                 <w:lang w:eastAsia="en-IN"/>
                 <w14:ligatures w14:val="none"/>
@@ -3686,6 +3620,8 @@
                 <w:rFonts w:ascii="Times New Roman" w:eastAsia="Times New Roman" w:hAnsi="Times New Roman" w:cs="Times New Roman"/>
                 <w:color w:val="1F1F1F"/>
                 <w:kern w:val="0"/>
+                <w:sz w:val="26"/>
+                <w:szCs w:val="26"/>
                 <w:lang w:eastAsia="en-IN"/>
                 <w14:ligatures w14:val="none"/>
               </w:rPr>
@@ -3695,6 +3631,8 @@
                 <w:rFonts w:ascii="Times New Roman" w:eastAsia="Times New Roman" w:hAnsi="Times New Roman" w:cs="Times New Roman"/>
                 <w:color w:val="1F1F1F"/>
                 <w:kern w:val="0"/>
+                <w:sz w:val="26"/>
+                <w:szCs w:val="26"/>
                 <w:lang w:eastAsia="en-IN"/>
                 <w14:ligatures w14:val="none"/>
               </w:rPr>
@@ -3715,6 +3653,8 @@
                 <w:rFonts w:ascii="Times New Roman" w:eastAsia="Times New Roman" w:hAnsi="Times New Roman" w:cs="Times New Roman"/>
                 <w:color w:val="1F1F1F"/>
                 <w:kern w:val="0"/>
+                <w:sz w:val="26"/>
+                <w:szCs w:val="26"/>
                 <w:lang w:eastAsia="en-IN"/>
                 <w14:ligatures w14:val="none"/>
               </w:rPr>
@@ -3724,6 +3664,8 @@
                 <w:rFonts w:ascii="Times New Roman" w:eastAsia="Times New Roman" w:hAnsi="Times New Roman" w:cs="Times New Roman"/>
                 <w:color w:val="1F1F1F"/>
                 <w:kern w:val="0"/>
+                <w:sz w:val="26"/>
+                <w:szCs w:val="26"/>
                 <w:bdr w:val="none" w:sz="0" w:space="0" w:color="auto" w:frame="1"/>
                 <w:lang w:eastAsia="en-IN"/>
                 <w14:ligatures w14:val="none"/>
@@ -3743,6 +3685,8 @@
                 <w:rFonts w:ascii="Times New Roman" w:eastAsia="Times New Roman" w:hAnsi="Times New Roman" w:cs="Times New Roman"/>
                 <w:color w:val="1F1F1F"/>
                 <w:kern w:val="0"/>
+                <w:sz w:val="26"/>
+                <w:szCs w:val="26"/>
                 <w:lang w:eastAsia="en-IN"/>
                 <w14:ligatures w14:val="none"/>
               </w:rPr>
@@ -3754,6 +3698,8 @@
                 <w:bCs/>
                 <w:color w:val="1F1F1F"/>
                 <w:kern w:val="0"/>
+                <w:sz w:val="26"/>
+                <w:szCs w:val="26"/>
                 <w:bdr w:val="none" w:sz="0" w:space="0" w:color="auto" w:frame="1"/>
                 <w:lang w:eastAsia="en-IN"/>
                 <w14:ligatures w14:val="none"/>
@@ -3774,6 +3720,8 @@
                 <w:rFonts w:ascii="Times New Roman" w:eastAsia="Times New Roman" w:hAnsi="Times New Roman" w:cs="Times New Roman"/>
                 <w:color w:val="1F1F1F"/>
                 <w:kern w:val="0"/>
+                <w:sz w:val="26"/>
+                <w:szCs w:val="26"/>
                 <w:lang w:eastAsia="en-IN"/>
                 <w14:ligatures w14:val="none"/>
               </w:rPr>
@@ -3783,6 +3731,8 @@
                 <w:rFonts w:ascii="Times New Roman" w:eastAsia="Times New Roman" w:hAnsi="Times New Roman" w:cs="Times New Roman"/>
                 <w:color w:val="1F1F1F"/>
                 <w:kern w:val="0"/>
+                <w:sz w:val="26"/>
+                <w:szCs w:val="26"/>
                 <w:lang w:eastAsia="en-IN"/>
                 <w14:ligatures w14:val="none"/>
               </w:rPr>
@@ -3803,6 +3753,8 @@
                 <w:rFonts w:ascii="Times New Roman" w:eastAsia="Times New Roman" w:hAnsi="Times New Roman" w:cs="Times New Roman"/>
                 <w:color w:val="1F1F1F"/>
                 <w:kern w:val="0"/>
+                <w:sz w:val="26"/>
+                <w:szCs w:val="26"/>
                 <w:lang w:eastAsia="en-IN"/>
                 <w14:ligatures w14:val="none"/>
               </w:rPr>
@@ -3812,6 +3764,8 @@
                 <w:rFonts w:ascii="Times New Roman" w:eastAsia="Times New Roman" w:hAnsi="Times New Roman" w:cs="Times New Roman"/>
                 <w:color w:val="1F1F1F"/>
                 <w:kern w:val="0"/>
+                <w:sz w:val="26"/>
+                <w:szCs w:val="26"/>
                 <w:bdr w:val="none" w:sz="0" w:space="0" w:color="auto" w:frame="1"/>
                 <w:lang w:eastAsia="en-IN"/>
                 <w14:ligatures w14:val="none"/>
@@ -3831,6 +3785,8 @@
                 <w:rFonts w:ascii="Times New Roman" w:eastAsia="Times New Roman" w:hAnsi="Times New Roman" w:cs="Times New Roman"/>
                 <w:color w:val="1F1F1F"/>
                 <w:kern w:val="0"/>
+                <w:sz w:val="26"/>
+                <w:szCs w:val="26"/>
                 <w:lang w:eastAsia="en-IN"/>
                 <w14:ligatures w14:val="none"/>
               </w:rPr>
@@ -3842,6 +3798,8 @@
                 <w:bCs/>
                 <w:color w:val="1F1F1F"/>
                 <w:kern w:val="0"/>
+                <w:sz w:val="26"/>
+                <w:szCs w:val="26"/>
                 <w:bdr w:val="none" w:sz="0" w:space="0" w:color="auto" w:frame="1"/>
                 <w:lang w:eastAsia="en-IN"/>
                 <w14:ligatures w14:val="none"/>
@@ -3862,6 +3820,8 @@
                 <w:rFonts w:ascii="Times New Roman" w:eastAsia="Times New Roman" w:hAnsi="Times New Roman" w:cs="Times New Roman"/>
                 <w:color w:val="1F1F1F"/>
                 <w:kern w:val="0"/>
+                <w:sz w:val="26"/>
+                <w:szCs w:val="26"/>
                 <w:lang w:eastAsia="en-IN"/>
                 <w14:ligatures w14:val="none"/>
               </w:rPr>
@@ -3871,6 +3831,8 @@
                 <w:rFonts w:ascii="Times New Roman" w:eastAsia="Times New Roman" w:hAnsi="Times New Roman" w:cs="Times New Roman"/>
                 <w:color w:val="1F1F1F"/>
                 <w:kern w:val="0"/>
+                <w:sz w:val="26"/>
+                <w:szCs w:val="26"/>
                 <w:lang w:eastAsia="en-IN"/>
                 <w14:ligatures w14:val="none"/>
               </w:rPr>
@@ -3891,6 +3853,8 @@
                 <w:rFonts w:ascii="Times New Roman" w:eastAsia="Times New Roman" w:hAnsi="Times New Roman" w:cs="Times New Roman"/>
                 <w:color w:val="1F1F1F"/>
                 <w:kern w:val="0"/>
+                <w:sz w:val="26"/>
+                <w:szCs w:val="26"/>
                 <w:lang w:eastAsia="en-IN"/>
                 <w14:ligatures w14:val="none"/>
               </w:rPr>
@@ -3900,6 +3864,8 @@
                 <w:rFonts w:ascii="Times New Roman" w:eastAsia="Times New Roman" w:hAnsi="Times New Roman" w:cs="Times New Roman"/>
                 <w:color w:val="1F1F1F"/>
                 <w:kern w:val="0"/>
+                <w:sz w:val="26"/>
+                <w:szCs w:val="26"/>
                 <w:bdr w:val="none" w:sz="0" w:space="0" w:color="auto" w:frame="1"/>
                 <w:lang w:eastAsia="en-IN"/>
                 <w14:ligatures w14:val="none"/>
@@ -3920,6 +3886,8 @@
                 <w:rFonts w:ascii="Times New Roman" w:eastAsia="Times New Roman" w:hAnsi="Times New Roman" w:cs="Times New Roman"/>
                 <w:color w:val="1F1F1F"/>
                 <w:kern w:val="0"/>
+                <w:sz w:val="26"/>
+                <w:szCs w:val="26"/>
                 <w:lang w:eastAsia="en-IN"/>
                 <w14:ligatures w14:val="none"/>
               </w:rPr>
@@ -3931,6 +3899,8 @@
                 <w:bCs/>
                 <w:color w:val="1F1F1F"/>
                 <w:kern w:val="0"/>
+                <w:sz w:val="26"/>
+                <w:szCs w:val="26"/>
                 <w:bdr w:val="none" w:sz="0" w:space="0" w:color="auto" w:frame="1"/>
                 <w:lang w:eastAsia="en-IN"/>
                 <w14:ligatures w14:val="none"/>
@@ -3945,6 +3915,8 @@
                 <w:rFonts w:ascii="Times New Roman" w:eastAsia="Times New Roman" w:hAnsi="Times New Roman" w:cs="Times New Roman"/>
                 <w:color w:val="1F1F1F"/>
                 <w:kern w:val="0"/>
+                <w:sz w:val="26"/>
+                <w:szCs w:val="26"/>
                 <w:lang w:eastAsia="en-IN"/>
                 <w14:ligatures w14:val="none"/>
               </w:rPr>
@@ -3954,6 +3926,8 @@
                 <w:rFonts w:ascii="Times New Roman" w:eastAsia="Times New Roman" w:hAnsi="Times New Roman" w:cs="Times New Roman"/>
                 <w:color w:val="1F1F1F"/>
                 <w:kern w:val="0"/>
+                <w:sz w:val="26"/>
+                <w:szCs w:val="26"/>
                 <w:lang w:eastAsia="en-IN"/>
                 <w14:ligatures w14:val="none"/>
               </w:rPr>
@@ -3967,6 +3941,8 @@
                 <w:rFonts w:ascii="Times New Roman" w:eastAsia="Times New Roman" w:hAnsi="Times New Roman" w:cs="Times New Roman"/>
                 <w:color w:val="1F1F1F"/>
                 <w:kern w:val="0"/>
+                <w:sz w:val="26"/>
+                <w:szCs w:val="26"/>
                 <w:lang w:eastAsia="en-IN"/>
                 <w14:ligatures w14:val="none"/>
               </w:rPr>
@@ -3976,6 +3952,8 @@
                 <w:rFonts w:ascii="Times New Roman" w:eastAsia="Times New Roman" w:hAnsi="Times New Roman" w:cs="Times New Roman"/>
                 <w:color w:val="1F1F1F"/>
                 <w:kern w:val="0"/>
+                <w:sz w:val="26"/>
+                <w:szCs w:val="26"/>
                 <w:lang w:eastAsia="en-IN"/>
                 <w14:ligatures w14:val="none"/>
               </w:rPr>
@@ -3989,6 +3967,8 @@
                 <w:rFonts w:ascii="Times New Roman" w:eastAsia="Times New Roman" w:hAnsi="Times New Roman" w:cs="Times New Roman"/>
                 <w:color w:val="1F1F1F"/>
                 <w:kern w:val="0"/>
+                <w:sz w:val="26"/>
+                <w:szCs w:val="26"/>
                 <w:lang w:eastAsia="en-IN"/>
                 <w14:ligatures w14:val="none"/>
               </w:rPr>
@@ -3998,6 +3978,8 @@
                 <w:rFonts w:ascii="Times New Roman" w:eastAsia="Times New Roman" w:hAnsi="Times New Roman" w:cs="Times New Roman"/>
                 <w:color w:val="1F1F1F"/>
                 <w:kern w:val="0"/>
+                <w:sz w:val="26"/>
+                <w:szCs w:val="26"/>
                 <w:lang w:eastAsia="en-IN"/>
                 <w14:ligatures w14:val="none"/>
               </w:rPr>
@@ -4017,6 +3999,8 @@
                 <w:rFonts w:ascii="Times New Roman" w:eastAsia="Times New Roman" w:hAnsi="Times New Roman" w:cs="Times New Roman"/>
                 <w:color w:val="1F1F1F"/>
                 <w:kern w:val="0"/>
+                <w:sz w:val="26"/>
+                <w:szCs w:val="26"/>
                 <w:lang w:eastAsia="en-IN"/>
                 <w14:ligatures w14:val="none"/>
               </w:rPr>
@@ -4026,6 +4010,8 @@
                 <w:rFonts w:ascii="Times New Roman" w:eastAsia="Times New Roman" w:hAnsi="Times New Roman" w:cs="Times New Roman"/>
                 <w:color w:val="1F1F1F"/>
                 <w:kern w:val="0"/>
+                <w:sz w:val="26"/>
+                <w:szCs w:val="26"/>
                 <w:lang w:eastAsia="en-IN"/>
                 <w14:ligatures w14:val="none"/>
               </w:rPr>
@@ -4046,6 +4032,8 @@
                 <w:rFonts w:ascii="Times New Roman" w:eastAsia="Times New Roman" w:hAnsi="Times New Roman" w:cs="Times New Roman"/>
                 <w:color w:val="1F1F1F"/>
                 <w:kern w:val="0"/>
+                <w:sz w:val="26"/>
+                <w:szCs w:val="26"/>
                 <w:lang w:eastAsia="en-IN"/>
                 <w14:ligatures w14:val="none"/>
               </w:rPr>
@@ -4055,6 +4043,8 @@
                 <w:rFonts w:ascii="Times New Roman" w:eastAsia="Times New Roman" w:hAnsi="Times New Roman" w:cs="Times New Roman"/>
                 <w:color w:val="1F1F1F"/>
                 <w:kern w:val="0"/>
+                <w:sz w:val="26"/>
+                <w:szCs w:val="26"/>
                 <w:bdr w:val="none" w:sz="0" w:space="0" w:color="auto" w:frame="1"/>
                 <w:lang w:eastAsia="en-IN"/>
                 <w14:ligatures w14:val="none"/>
@@ -4074,6 +4064,8 @@
                 <w:rFonts w:ascii="Times New Roman" w:eastAsia="Times New Roman" w:hAnsi="Times New Roman" w:cs="Times New Roman"/>
                 <w:color w:val="1F1F1F"/>
                 <w:kern w:val="0"/>
+                <w:sz w:val="26"/>
+                <w:szCs w:val="26"/>
                 <w:lang w:eastAsia="en-IN"/>
                 <w14:ligatures w14:val="none"/>
               </w:rPr>
@@ -4085,6 +4077,8 @@
                 <w:bCs/>
                 <w:color w:val="1F1F1F"/>
                 <w:kern w:val="0"/>
+                <w:sz w:val="26"/>
+                <w:szCs w:val="26"/>
                 <w:bdr w:val="none" w:sz="0" w:space="0" w:color="auto" w:frame="1"/>
                 <w:lang w:eastAsia="en-IN"/>
                 <w14:ligatures w14:val="none"/>
@@ -4105,6 +4099,8 @@
                 <w:rFonts w:ascii="Times New Roman" w:eastAsia="Times New Roman" w:hAnsi="Times New Roman" w:cs="Times New Roman"/>
                 <w:color w:val="1F1F1F"/>
                 <w:kern w:val="0"/>
+                <w:sz w:val="26"/>
+                <w:szCs w:val="26"/>
                 <w:lang w:eastAsia="en-IN"/>
                 <w14:ligatures w14:val="none"/>
               </w:rPr>
@@ -4114,6 +4110,8 @@
                 <w:rFonts w:ascii="Times New Roman" w:eastAsia="Times New Roman" w:hAnsi="Times New Roman" w:cs="Times New Roman"/>
                 <w:color w:val="1F1F1F"/>
                 <w:kern w:val="0"/>
+                <w:sz w:val="26"/>
+                <w:szCs w:val="26"/>
                 <w:lang w:eastAsia="en-IN"/>
                 <w14:ligatures w14:val="none"/>
               </w:rPr>
@@ -4134,6 +4132,8 @@
                 <w:rFonts w:ascii="Times New Roman" w:eastAsia="Times New Roman" w:hAnsi="Times New Roman" w:cs="Times New Roman"/>
                 <w:color w:val="1F1F1F"/>
                 <w:kern w:val="0"/>
+                <w:sz w:val="26"/>
+                <w:szCs w:val="26"/>
                 <w:lang w:eastAsia="en-IN"/>
                 <w14:ligatures w14:val="none"/>
               </w:rPr>
@@ -4143,6 +4143,8 @@
                 <w:rFonts w:ascii="Times New Roman" w:eastAsia="Times New Roman" w:hAnsi="Times New Roman" w:cs="Times New Roman"/>
                 <w:color w:val="1F1F1F"/>
                 <w:kern w:val="0"/>
+                <w:sz w:val="26"/>
+                <w:szCs w:val="26"/>
                 <w:bdr w:val="none" w:sz="0" w:space="0" w:color="auto" w:frame="1"/>
                 <w:lang w:eastAsia="en-IN"/>
                 <w14:ligatures w14:val="none"/>
@@ -4162,6 +4164,8 @@
                 <w:rFonts w:ascii="Times New Roman" w:eastAsia="Times New Roman" w:hAnsi="Times New Roman" w:cs="Times New Roman"/>
                 <w:color w:val="1F1F1F"/>
                 <w:kern w:val="0"/>
+                <w:sz w:val="26"/>
+                <w:szCs w:val="26"/>
                 <w:lang w:eastAsia="en-IN"/>
                 <w14:ligatures w14:val="none"/>
               </w:rPr>
@@ -4173,6 +4177,8 @@
                 <w:bCs/>
                 <w:color w:val="1F1F1F"/>
                 <w:kern w:val="0"/>
+                <w:sz w:val="26"/>
+                <w:szCs w:val="26"/>
                 <w:bdr w:val="none" w:sz="0" w:space="0" w:color="auto" w:frame="1"/>
                 <w:lang w:eastAsia="en-IN"/>
                 <w14:ligatures w14:val="none"/>
@@ -4193,6 +4199,8 @@
                 <w:rFonts w:ascii="Times New Roman" w:eastAsia="Times New Roman" w:hAnsi="Times New Roman" w:cs="Times New Roman"/>
                 <w:color w:val="1F1F1F"/>
                 <w:kern w:val="0"/>
+                <w:sz w:val="26"/>
+                <w:szCs w:val="26"/>
                 <w:lang w:eastAsia="en-IN"/>
                 <w14:ligatures w14:val="none"/>
               </w:rPr>
@@ -4202,6 +4210,8 @@
                 <w:rFonts w:ascii="Times New Roman" w:eastAsia="Times New Roman" w:hAnsi="Times New Roman" w:cs="Times New Roman"/>
                 <w:color w:val="1F1F1F"/>
                 <w:kern w:val="0"/>
+                <w:sz w:val="26"/>
+                <w:szCs w:val="26"/>
                 <w:lang w:eastAsia="en-IN"/>
                 <w14:ligatures w14:val="none"/>
               </w:rPr>
@@ -4222,6 +4232,8 @@
                 <w:rFonts w:ascii="Times New Roman" w:eastAsia="Times New Roman" w:hAnsi="Times New Roman" w:cs="Times New Roman"/>
                 <w:color w:val="1F1F1F"/>
                 <w:kern w:val="0"/>
+                <w:sz w:val="26"/>
+                <w:szCs w:val="26"/>
                 <w:lang w:eastAsia="en-IN"/>
                 <w14:ligatures w14:val="none"/>
               </w:rPr>
@@ -4233,6 +4245,8 @@
                 <w:bCs/>
                 <w:color w:val="1F1F1F"/>
                 <w:kern w:val="0"/>
+                <w:sz w:val="26"/>
+                <w:szCs w:val="26"/>
                 <w:bdr w:val="none" w:sz="0" w:space="0" w:color="auto" w:frame="1"/>
                 <w:lang w:eastAsia="en-IN"/>
                 <w14:ligatures w14:val="none"/>
@@ -4252,6 +4266,8 @@
                 <w:rFonts w:ascii="Times New Roman" w:eastAsia="Times New Roman" w:hAnsi="Times New Roman" w:cs="Times New Roman"/>
                 <w:color w:val="1F1F1F"/>
                 <w:kern w:val="0"/>
+                <w:sz w:val="26"/>
+                <w:szCs w:val="26"/>
                 <w:lang w:eastAsia="en-IN"/>
                 <w14:ligatures w14:val="none"/>
               </w:rPr>
@@ -4263,6 +4279,8 @@
                 <w:bCs/>
                 <w:color w:val="1F1F1F"/>
                 <w:kern w:val="0"/>
+                <w:sz w:val="26"/>
+                <w:szCs w:val="26"/>
                 <w:bdr w:val="none" w:sz="0" w:space="0" w:color="auto" w:frame="1"/>
                 <w:lang w:eastAsia="en-IN"/>
                 <w14:ligatures w14:val="none"/>
@@ -4283,6 +4301,8 @@
                 <w:rFonts w:ascii="Times New Roman" w:eastAsia="Times New Roman" w:hAnsi="Times New Roman" w:cs="Times New Roman"/>
                 <w:color w:val="1F1F1F"/>
                 <w:kern w:val="0"/>
+                <w:sz w:val="26"/>
+                <w:szCs w:val="26"/>
                 <w:lang w:eastAsia="en-IN"/>
                 <w14:ligatures w14:val="none"/>
               </w:rPr>
@@ -4292,6 +4312,8 @@
                 <w:rFonts w:ascii="Times New Roman" w:eastAsia="Times New Roman" w:hAnsi="Times New Roman" w:cs="Times New Roman"/>
                 <w:color w:val="1F1F1F"/>
                 <w:kern w:val="0"/>
+                <w:sz w:val="26"/>
+                <w:szCs w:val="26"/>
                 <w:lang w:eastAsia="en-IN"/>
                 <w14:ligatures w14:val="none"/>
               </w:rPr>
@@ -4312,6 +4334,8 @@
                 <w:rFonts w:ascii="Times New Roman" w:eastAsia="Times New Roman" w:hAnsi="Times New Roman" w:cs="Times New Roman"/>
                 <w:color w:val="1F1F1F"/>
                 <w:kern w:val="0"/>
+                <w:sz w:val="26"/>
+                <w:szCs w:val="26"/>
                 <w:lang w:eastAsia="en-IN"/>
                 <w14:ligatures w14:val="none"/>
               </w:rPr>
@@ -4321,6 +4345,8 @@
                 <w:rFonts w:ascii="Times New Roman" w:eastAsia="Times New Roman" w:hAnsi="Times New Roman" w:cs="Times New Roman"/>
                 <w:color w:val="1F1F1F"/>
                 <w:kern w:val="0"/>
+                <w:sz w:val="26"/>
+                <w:szCs w:val="26"/>
                 <w:bdr w:val="none" w:sz="0" w:space="0" w:color="auto" w:frame="1"/>
                 <w:lang w:eastAsia="en-IN"/>
                 <w14:ligatures w14:val="none"/>
@@ -4340,6 +4366,8 @@
                 <w:rFonts w:ascii="Times New Roman" w:eastAsia="Times New Roman" w:hAnsi="Times New Roman" w:cs="Times New Roman"/>
                 <w:color w:val="1F1F1F"/>
                 <w:kern w:val="0"/>
+                <w:sz w:val="26"/>
+                <w:szCs w:val="26"/>
                 <w:lang w:eastAsia="en-IN"/>
                 <w14:ligatures w14:val="none"/>
               </w:rPr>
@@ -4349,6 +4377,8 @@
                 <w:rFonts w:ascii="Times New Roman" w:eastAsia="Times New Roman" w:hAnsi="Times New Roman" w:cs="Times New Roman"/>
                 <w:color w:val="1F1F1F"/>
                 <w:kern w:val="0"/>
+                <w:sz w:val="26"/>
+                <w:szCs w:val="26"/>
                 <w:bdr w:val="none" w:sz="0" w:space="0" w:color="auto" w:frame="1"/>
                 <w:lang w:eastAsia="en-IN"/>
                 <w14:ligatures w14:val="none"/>
@@ -4369,6 +4399,8 @@
                 <w:rFonts w:ascii="Times New Roman" w:eastAsia="Times New Roman" w:hAnsi="Times New Roman" w:cs="Times New Roman"/>
                 <w:color w:val="1F1F1F"/>
                 <w:kern w:val="0"/>
+                <w:sz w:val="26"/>
+                <w:szCs w:val="26"/>
                 <w:lang w:eastAsia="en-IN"/>
                 <w14:ligatures w14:val="none"/>
               </w:rPr>
@@ -4378,6 +4410,8 @@
                 <w:rFonts w:ascii="Times New Roman" w:eastAsia="Times New Roman" w:hAnsi="Times New Roman" w:cs="Times New Roman"/>
                 <w:color w:val="1F1F1F"/>
                 <w:kern w:val="0"/>
+                <w:sz w:val="26"/>
+                <w:szCs w:val="26"/>
                 <w:lang w:eastAsia="en-IN"/>
                 <w14:ligatures w14:val="none"/>
               </w:rPr>
@@ -4398,6 +4432,8 @@
                 <w:rFonts w:ascii="Times New Roman" w:eastAsia="Times New Roman" w:hAnsi="Times New Roman" w:cs="Times New Roman"/>
                 <w:color w:val="1F1F1F"/>
                 <w:kern w:val="0"/>
+                <w:sz w:val="26"/>
+                <w:szCs w:val="26"/>
                 <w:lang w:eastAsia="en-IN"/>
                 <w14:ligatures w14:val="none"/>
               </w:rPr>
@@ -4407,6 +4443,8 @@
                 <w:rFonts w:ascii="Times New Roman" w:eastAsia="Times New Roman" w:hAnsi="Times New Roman" w:cs="Times New Roman"/>
                 <w:color w:val="1F1F1F"/>
                 <w:kern w:val="0"/>
+                <w:sz w:val="26"/>
+                <w:szCs w:val="26"/>
                 <w:bdr w:val="none" w:sz="0" w:space="0" w:color="auto" w:frame="1"/>
                 <w:lang w:eastAsia="en-IN"/>
                 <w14:ligatures w14:val="none"/>
@@ -4426,6 +4464,8 @@
                 <w:rFonts w:ascii="Times New Roman" w:eastAsia="Times New Roman" w:hAnsi="Times New Roman" w:cs="Times New Roman"/>
                 <w:color w:val="1F1F1F"/>
                 <w:kern w:val="0"/>
+                <w:sz w:val="26"/>
+                <w:szCs w:val="26"/>
                 <w:lang w:eastAsia="en-IN"/>
                 <w14:ligatures w14:val="none"/>
               </w:rPr>
@@ -4435,6 +4475,8 @@
                 <w:rFonts w:ascii="Times New Roman" w:eastAsia="Times New Roman" w:hAnsi="Times New Roman" w:cs="Times New Roman"/>
                 <w:color w:val="1F1F1F"/>
                 <w:kern w:val="0"/>
+                <w:sz w:val="26"/>
+                <w:szCs w:val="26"/>
                 <w:bdr w:val="none" w:sz="0" w:space="0" w:color="auto" w:frame="1"/>
                 <w:lang w:eastAsia="en-IN"/>
                 <w14:ligatures w14:val="none"/>
@@ -4458,6 +4500,8 @@
                 <w:rFonts w:ascii="Times New Roman" w:eastAsia="Times New Roman" w:hAnsi="Times New Roman" w:cs="Times New Roman"/>
                 <w:color w:val="1F1F1F"/>
                 <w:kern w:val="0"/>
+                <w:sz w:val="26"/>
+                <w:szCs w:val="26"/>
                 <w:lang w:eastAsia="en-IN"/>
                 <w14:ligatures w14:val="none"/>
               </w:rPr>
@@ -4467,6 +4511,8 @@
                 <w:rFonts w:ascii="Times New Roman" w:eastAsia="Times New Roman" w:hAnsi="Times New Roman" w:cs="Times New Roman"/>
                 <w:color w:val="1F1F1F"/>
                 <w:kern w:val="0"/>
+                <w:sz w:val="26"/>
+                <w:szCs w:val="26"/>
                 <w:lang w:eastAsia="en-IN"/>
                 <w14:ligatures w14:val="none"/>
               </w:rPr>
@@ -4487,6 +4533,8 @@
                 <w:rFonts w:ascii="Times New Roman" w:eastAsia="Times New Roman" w:hAnsi="Times New Roman" w:cs="Times New Roman"/>
                 <w:color w:val="1F1F1F"/>
                 <w:kern w:val="0"/>
+                <w:sz w:val="26"/>
+                <w:szCs w:val="26"/>
                 <w:lang w:eastAsia="en-IN"/>
                 <w14:ligatures w14:val="none"/>
               </w:rPr>
@@ -4496,6 +4544,8 @@
                 <w:rFonts w:ascii="Times New Roman" w:eastAsia="Times New Roman" w:hAnsi="Times New Roman" w:cs="Times New Roman"/>
                 <w:color w:val="1F1F1F"/>
                 <w:kern w:val="0"/>
+                <w:sz w:val="26"/>
+                <w:szCs w:val="26"/>
                 <w:bdr w:val="none" w:sz="0" w:space="0" w:color="auto" w:frame="1"/>
                 <w:lang w:eastAsia="en-IN"/>
                 <w14:ligatures w14:val="none"/>
@@ -4515,6 +4565,8 @@
                 <w:rFonts w:ascii="Times New Roman" w:eastAsia="Times New Roman" w:hAnsi="Times New Roman" w:cs="Times New Roman"/>
                 <w:color w:val="1F1F1F"/>
                 <w:kern w:val="0"/>
+                <w:sz w:val="26"/>
+                <w:szCs w:val="26"/>
                 <w:lang w:eastAsia="en-IN"/>
                 <w14:ligatures w14:val="none"/>
               </w:rPr>
@@ -4524,6 +4576,8 @@
                 <w:rFonts w:ascii="Times New Roman" w:eastAsia="Times New Roman" w:hAnsi="Times New Roman" w:cs="Times New Roman"/>
                 <w:color w:val="1F1F1F"/>
                 <w:kern w:val="0"/>
+                <w:sz w:val="26"/>
+                <w:szCs w:val="26"/>
                 <w:bdr w:val="none" w:sz="0" w:space="0" w:color="auto" w:frame="1"/>
                 <w:lang w:eastAsia="en-IN"/>
                 <w14:ligatures w14:val="none"/>
@@ -4544,6 +4598,8 @@
                 <w:rFonts w:ascii="Times New Roman" w:eastAsia="Times New Roman" w:hAnsi="Times New Roman" w:cs="Times New Roman"/>
                 <w:color w:val="1F1F1F"/>
                 <w:kern w:val="0"/>
+                <w:sz w:val="26"/>
+                <w:szCs w:val="26"/>
                 <w:lang w:eastAsia="en-IN"/>
                 <w14:ligatures w14:val="none"/>
               </w:rPr>
@@ -4553,6 +4609,8 @@
                 <w:rFonts w:ascii="Times New Roman" w:eastAsia="Times New Roman" w:hAnsi="Times New Roman" w:cs="Times New Roman"/>
                 <w:color w:val="1F1F1F"/>
                 <w:kern w:val="0"/>
+                <w:sz w:val="26"/>
+                <w:szCs w:val="26"/>
                 <w:lang w:eastAsia="en-IN"/>
                 <w14:ligatures w14:val="none"/>
               </w:rPr>
@@ -4573,6 +4631,8 @@
                 <w:rFonts w:ascii="Times New Roman" w:eastAsia="Times New Roman" w:hAnsi="Times New Roman" w:cs="Times New Roman"/>
                 <w:color w:val="1F1F1F"/>
                 <w:kern w:val="0"/>
+                <w:sz w:val="26"/>
+                <w:szCs w:val="26"/>
                 <w:lang w:eastAsia="en-IN"/>
                 <w14:ligatures w14:val="none"/>
               </w:rPr>
@@ -4584,6 +4644,8 @@
                 <w:bCs/>
                 <w:color w:val="1F1F1F"/>
                 <w:kern w:val="0"/>
+                <w:sz w:val="26"/>
+                <w:szCs w:val="26"/>
                 <w:bdr w:val="none" w:sz="0" w:space="0" w:color="auto" w:frame="1"/>
                 <w:lang w:eastAsia="en-IN"/>
                 <w14:ligatures w14:val="none"/>
@@ -4603,6 +4665,8 @@
                 <w:rFonts w:ascii="Times New Roman" w:eastAsia="Times New Roman" w:hAnsi="Times New Roman" w:cs="Times New Roman"/>
                 <w:color w:val="1F1F1F"/>
                 <w:kern w:val="0"/>
+                <w:sz w:val="26"/>
+                <w:szCs w:val="26"/>
                 <w:lang w:eastAsia="en-IN"/>
                 <w14:ligatures w14:val="none"/>
               </w:rPr>
@@ -4614,6 +4678,8 @@
                 <w:bCs/>
                 <w:color w:val="1F1F1F"/>
                 <w:kern w:val="0"/>
+                <w:sz w:val="26"/>
+                <w:szCs w:val="26"/>
                 <w:bdr w:val="none" w:sz="0" w:space="0" w:color="auto" w:frame="1"/>
                 <w:lang w:eastAsia="en-IN"/>
                 <w14:ligatures w14:val="none"/>
@@ -4634,6 +4700,8 @@
                 <w:rFonts w:ascii="Times New Roman" w:eastAsia="Times New Roman" w:hAnsi="Times New Roman" w:cs="Times New Roman"/>
                 <w:color w:val="1F1F1F"/>
                 <w:kern w:val="0"/>
+                <w:sz w:val="26"/>
+                <w:szCs w:val="26"/>
                 <w:lang w:eastAsia="en-IN"/>
                 <w14:ligatures w14:val="none"/>
               </w:rPr>
@@ -4643,6 +4711,8 @@
                 <w:rFonts w:ascii="Times New Roman" w:eastAsia="Times New Roman" w:hAnsi="Times New Roman" w:cs="Times New Roman"/>
                 <w:color w:val="1F1F1F"/>
                 <w:kern w:val="0"/>
+                <w:sz w:val="26"/>
+                <w:szCs w:val="26"/>
                 <w:lang w:eastAsia="en-IN"/>
                 <w14:ligatures w14:val="none"/>
               </w:rPr>
@@ -4666,6 +4736,8 @@
                 <w:rFonts w:ascii="Times New Roman" w:eastAsia="Times New Roman" w:hAnsi="Times New Roman" w:cs="Times New Roman"/>
                 <w:color w:val="1F1F1F"/>
                 <w:kern w:val="0"/>
+                <w:sz w:val="26"/>
+                <w:szCs w:val="26"/>
                 <w:lang w:eastAsia="en-IN"/>
                 <w14:ligatures w14:val="none"/>
               </w:rPr>
@@ -4675,6 +4747,8 @@
                 <w:rFonts w:ascii="Times New Roman" w:eastAsia="Times New Roman" w:hAnsi="Times New Roman" w:cs="Times New Roman"/>
                 <w:color w:val="1F1F1F"/>
                 <w:kern w:val="0"/>
+                <w:sz w:val="26"/>
+                <w:szCs w:val="26"/>
                 <w:bdr w:val="none" w:sz="0" w:space="0" w:color="auto" w:frame="1"/>
                 <w:lang w:eastAsia="en-IN"/>
                 <w14:ligatures w14:val="none"/>
@@ -4694,6 +4768,8 @@
                 <w:rFonts w:ascii="Times New Roman" w:eastAsia="Times New Roman" w:hAnsi="Times New Roman" w:cs="Times New Roman"/>
                 <w:color w:val="1F1F1F"/>
                 <w:kern w:val="0"/>
+                <w:sz w:val="26"/>
+                <w:szCs w:val="26"/>
                 <w:lang w:eastAsia="en-IN"/>
                 <w14:ligatures w14:val="none"/>
               </w:rPr>
@@ -4703,6 +4779,8 @@
                 <w:rFonts w:ascii="Times New Roman" w:eastAsia="Times New Roman" w:hAnsi="Times New Roman" w:cs="Times New Roman"/>
                 <w:color w:val="1F1F1F"/>
                 <w:kern w:val="0"/>
+                <w:sz w:val="26"/>
+                <w:szCs w:val="26"/>
                 <w:bdr w:val="none" w:sz="0" w:space="0" w:color="auto" w:frame="1"/>
                 <w:lang w:eastAsia="en-IN"/>
                 <w14:ligatures w14:val="none"/>
@@ -4723,6 +4801,8 @@
                 <w:rFonts w:ascii="Times New Roman" w:eastAsia="Times New Roman" w:hAnsi="Times New Roman" w:cs="Times New Roman"/>
                 <w:color w:val="1F1F1F"/>
                 <w:kern w:val="0"/>
+                <w:sz w:val="26"/>
+                <w:szCs w:val="26"/>
                 <w:lang w:eastAsia="en-IN"/>
                 <w14:ligatures w14:val="none"/>
               </w:rPr>
@@ -4732,6 +4812,8 @@
                 <w:rFonts w:ascii="Times New Roman" w:eastAsia="Times New Roman" w:hAnsi="Times New Roman" w:cs="Times New Roman"/>
                 <w:color w:val="1F1F1F"/>
                 <w:kern w:val="0"/>
+                <w:sz w:val="26"/>
+                <w:szCs w:val="26"/>
                 <w:lang w:eastAsia="en-IN"/>
                 <w14:ligatures w14:val="none"/>
               </w:rPr>
@@ -4752,6 +4834,8 @@
                 <w:rFonts w:ascii="Times New Roman" w:eastAsia="Times New Roman" w:hAnsi="Times New Roman" w:cs="Times New Roman"/>
                 <w:color w:val="1F1F1F"/>
                 <w:kern w:val="0"/>
+                <w:sz w:val="26"/>
+                <w:szCs w:val="26"/>
                 <w:lang w:eastAsia="en-IN"/>
                 <w14:ligatures w14:val="none"/>
               </w:rPr>
@@ -4761,6 +4845,8 @@
                 <w:rFonts w:ascii="Times New Roman" w:eastAsia="Times New Roman" w:hAnsi="Times New Roman" w:cs="Times New Roman"/>
                 <w:color w:val="1F1F1F"/>
                 <w:kern w:val="0"/>
+                <w:sz w:val="26"/>
+                <w:szCs w:val="26"/>
                 <w:bdr w:val="none" w:sz="0" w:space="0" w:color="auto" w:frame="1"/>
                 <w:lang w:eastAsia="en-IN"/>
                 <w14:ligatures w14:val="none"/>
@@ -4780,6 +4866,8 @@
                 <w:rFonts w:ascii="Times New Roman" w:eastAsia="Times New Roman" w:hAnsi="Times New Roman" w:cs="Times New Roman"/>
                 <w:color w:val="1F1F1F"/>
                 <w:kern w:val="0"/>
+                <w:sz w:val="26"/>
+                <w:szCs w:val="26"/>
                 <w:lang w:eastAsia="en-IN"/>
                 <w14:ligatures w14:val="none"/>
               </w:rPr>
@@ -4789,6 +4877,8 @@
                 <w:rFonts w:ascii="Times New Roman" w:eastAsia="Times New Roman" w:hAnsi="Times New Roman" w:cs="Times New Roman"/>
                 <w:color w:val="1F1F1F"/>
                 <w:kern w:val="0"/>
+                <w:sz w:val="26"/>
+                <w:szCs w:val="26"/>
                 <w:bdr w:val="none" w:sz="0" w:space="0" w:color="auto" w:frame="1"/>
                 <w:lang w:eastAsia="en-IN"/>
                 <w14:ligatures w14:val="none"/>
@@ -4809,6 +4899,8 @@
                 <w:rFonts w:ascii="Times New Roman" w:eastAsia="Times New Roman" w:hAnsi="Times New Roman" w:cs="Times New Roman"/>
                 <w:color w:val="1F1F1F"/>
                 <w:kern w:val="0"/>
+                <w:sz w:val="26"/>
+                <w:szCs w:val="26"/>
                 <w:lang w:eastAsia="en-IN"/>
                 <w14:ligatures w14:val="none"/>
               </w:rPr>
@@ -4818,6 +4910,8 @@
                 <w:rFonts w:ascii="Times New Roman" w:eastAsia="Times New Roman" w:hAnsi="Times New Roman" w:cs="Times New Roman"/>
                 <w:color w:val="1F1F1F"/>
                 <w:kern w:val="0"/>
+                <w:sz w:val="26"/>
+                <w:szCs w:val="26"/>
                 <w:lang w:eastAsia="en-IN"/>
                 <w14:ligatures w14:val="none"/>
               </w:rPr>
@@ -4838,6 +4932,8 @@
                 <w:rFonts w:ascii="Times New Roman" w:eastAsia="Times New Roman" w:hAnsi="Times New Roman" w:cs="Times New Roman"/>
                 <w:color w:val="1F1F1F"/>
                 <w:kern w:val="0"/>
+                <w:sz w:val="26"/>
+                <w:szCs w:val="26"/>
                 <w:lang w:eastAsia="en-IN"/>
                 <w14:ligatures w14:val="none"/>
               </w:rPr>
@@ -4847,6 +4943,8 @@
                 <w:rFonts w:ascii="Times New Roman" w:eastAsia="Times New Roman" w:hAnsi="Times New Roman" w:cs="Times New Roman"/>
                 <w:color w:val="1F1F1F"/>
                 <w:kern w:val="0"/>
+                <w:sz w:val="26"/>
+                <w:szCs w:val="26"/>
                 <w:bdr w:val="none" w:sz="0" w:space="0" w:color="auto" w:frame="1"/>
                 <w:lang w:eastAsia="en-IN"/>
                 <w14:ligatures w14:val="none"/>
@@ -4866,6 +4964,8 @@
                 <w:rFonts w:ascii="Times New Roman" w:eastAsia="Times New Roman" w:hAnsi="Times New Roman" w:cs="Times New Roman"/>
                 <w:color w:val="1F1F1F"/>
                 <w:kern w:val="0"/>
+                <w:sz w:val="26"/>
+                <w:szCs w:val="26"/>
                 <w:lang w:eastAsia="en-IN"/>
                 <w14:ligatures w14:val="none"/>
               </w:rPr>
@@ -4875,6 +4975,8 @@
                 <w:rFonts w:ascii="Times New Roman" w:eastAsia="Times New Roman" w:hAnsi="Times New Roman" w:cs="Times New Roman"/>
                 <w:color w:val="1F1F1F"/>
                 <w:kern w:val="0"/>
+                <w:sz w:val="26"/>
+                <w:szCs w:val="26"/>
                 <w:bdr w:val="none" w:sz="0" w:space="0" w:color="auto" w:frame="1"/>
                 <w:lang w:eastAsia="en-IN"/>
                 <w14:ligatures w14:val="none"/>
@@ -4895,6 +4997,8 @@
                 <w:rFonts w:ascii="Times New Roman" w:eastAsia="Times New Roman" w:hAnsi="Times New Roman" w:cs="Times New Roman"/>
                 <w:color w:val="1F1F1F"/>
                 <w:kern w:val="0"/>
+                <w:sz w:val="26"/>
+                <w:szCs w:val="26"/>
                 <w:lang w:eastAsia="en-IN"/>
                 <w14:ligatures w14:val="none"/>
               </w:rPr>
@@ -4904,6 +5008,8 @@
                 <w:rFonts w:ascii="Times New Roman" w:eastAsia="Times New Roman" w:hAnsi="Times New Roman" w:cs="Times New Roman"/>
                 <w:color w:val="1F1F1F"/>
                 <w:kern w:val="0"/>
+                <w:sz w:val="26"/>
+                <w:szCs w:val="26"/>
                 <w:lang w:eastAsia="en-IN"/>
                 <w14:ligatures w14:val="none"/>
               </w:rPr>
@@ -4924,6 +5030,8 @@
                 <w:rFonts w:ascii="Times New Roman" w:eastAsia="Times New Roman" w:hAnsi="Times New Roman" w:cs="Times New Roman"/>
                 <w:color w:val="1F1F1F"/>
                 <w:kern w:val="0"/>
+                <w:sz w:val="26"/>
+                <w:szCs w:val="26"/>
                 <w:lang w:eastAsia="en-IN"/>
                 <w14:ligatures w14:val="none"/>
               </w:rPr>
@@ -4933,6 +5041,8 @@
                 <w:rFonts w:ascii="Times New Roman" w:eastAsia="Times New Roman" w:hAnsi="Times New Roman" w:cs="Times New Roman"/>
                 <w:color w:val="1F1F1F"/>
                 <w:kern w:val="0"/>
+                <w:sz w:val="26"/>
+                <w:szCs w:val="26"/>
                 <w:bdr w:val="none" w:sz="0" w:space="0" w:color="auto" w:frame="1"/>
                 <w:lang w:eastAsia="en-IN"/>
                 <w14:ligatures w14:val="none"/>
@@ -4952,6 +5062,8 @@
                 <w:rFonts w:ascii="Times New Roman" w:eastAsia="Times New Roman" w:hAnsi="Times New Roman" w:cs="Times New Roman"/>
                 <w:color w:val="1F1F1F"/>
                 <w:kern w:val="0"/>
+                <w:sz w:val="26"/>
+                <w:szCs w:val="26"/>
                 <w:lang w:eastAsia="en-IN"/>
                 <w14:ligatures w14:val="none"/>
               </w:rPr>
@@ -4961,6 +5073,8 @@
                 <w:rFonts w:ascii="Times New Roman" w:eastAsia="Times New Roman" w:hAnsi="Times New Roman" w:cs="Times New Roman"/>
                 <w:color w:val="1F1F1F"/>
                 <w:kern w:val="0"/>
+                <w:sz w:val="26"/>
+                <w:szCs w:val="26"/>
                 <w:bdr w:val="none" w:sz="0" w:space="0" w:color="auto" w:frame="1"/>
                 <w:lang w:eastAsia="en-IN"/>
                 <w14:ligatures w14:val="none"/>
@@ -4981,6 +5095,8 @@
                 <w:rFonts w:ascii="Times New Roman" w:eastAsia="Times New Roman" w:hAnsi="Times New Roman" w:cs="Times New Roman"/>
                 <w:color w:val="1F1F1F"/>
                 <w:kern w:val="0"/>
+                <w:sz w:val="26"/>
+                <w:szCs w:val="26"/>
                 <w:lang w:eastAsia="en-IN"/>
                 <w14:ligatures w14:val="none"/>
               </w:rPr>
@@ -4990,6 +5106,8 @@
                 <w:rFonts w:ascii="Times New Roman" w:eastAsia="Times New Roman" w:hAnsi="Times New Roman" w:cs="Times New Roman"/>
                 <w:color w:val="1F1F1F"/>
                 <w:kern w:val="0"/>
+                <w:sz w:val="26"/>
+                <w:szCs w:val="26"/>
                 <w:lang w:eastAsia="en-IN"/>
                 <w14:ligatures w14:val="none"/>
               </w:rPr>
@@ -5010,6 +5128,8 @@
                 <w:rFonts w:ascii="Times New Roman" w:eastAsia="Times New Roman" w:hAnsi="Times New Roman" w:cs="Times New Roman"/>
                 <w:color w:val="1F1F1F"/>
                 <w:kern w:val="0"/>
+                <w:sz w:val="26"/>
+                <w:szCs w:val="26"/>
                 <w:lang w:eastAsia="en-IN"/>
                 <w14:ligatures w14:val="none"/>
               </w:rPr>
@@ -5021,6 +5141,8 @@
                 <w:bCs/>
                 <w:color w:val="1F1F1F"/>
                 <w:kern w:val="0"/>
+                <w:sz w:val="26"/>
+                <w:szCs w:val="26"/>
                 <w:bdr w:val="none" w:sz="0" w:space="0" w:color="auto" w:frame="1"/>
                 <w:lang w:eastAsia="en-IN"/>
                 <w14:ligatures w14:val="none"/>
@@ -5040,6 +5162,8 @@
                 <w:rFonts w:ascii="Times New Roman" w:eastAsia="Times New Roman" w:hAnsi="Times New Roman" w:cs="Times New Roman"/>
                 <w:color w:val="1F1F1F"/>
                 <w:kern w:val="0"/>
+                <w:sz w:val="26"/>
+                <w:szCs w:val="26"/>
                 <w:lang w:eastAsia="en-IN"/>
                 <w14:ligatures w14:val="none"/>
               </w:rPr>
@@ -5051,6 +5175,8 @@
                 <w:bCs/>
                 <w:color w:val="1F1F1F"/>
                 <w:kern w:val="0"/>
+                <w:sz w:val="26"/>
+                <w:szCs w:val="26"/>
                 <w:bdr w:val="none" w:sz="0" w:space="0" w:color="auto" w:frame="1"/>
                 <w:lang w:eastAsia="en-IN"/>
                 <w14:ligatures w14:val="none"/>
@@ -5071,6 +5197,8 @@
                 <w:rFonts w:ascii="Times New Roman" w:eastAsia="Times New Roman" w:hAnsi="Times New Roman" w:cs="Times New Roman"/>
                 <w:color w:val="1F1F1F"/>
                 <w:kern w:val="0"/>
+                <w:sz w:val="26"/>
+                <w:szCs w:val="26"/>
                 <w:lang w:eastAsia="en-IN"/>
                 <w14:ligatures w14:val="none"/>
               </w:rPr>
@@ -5080,6 +5208,8 @@
                 <w:rFonts w:ascii="Times New Roman" w:eastAsia="Times New Roman" w:hAnsi="Times New Roman" w:cs="Times New Roman"/>
                 <w:color w:val="1F1F1F"/>
                 <w:kern w:val="0"/>
+                <w:sz w:val="26"/>
+                <w:szCs w:val="26"/>
                 <w:lang w:eastAsia="en-IN"/>
                 <w14:ligatures w14:val="none"/>
               </w:rPr>
@@ -5100,6 +5230,8 @@
                 <w:rFonts w:ascii="Times New Roman" w:eastAsia="Times New Roman" w:hAnsi="Times New Roman" w:cs="Times New Roman"/>
                 <w:color w:val="1F1F1F"/>
                 <w:kern w:val="0"/>
+                <w:sz w:val="26"/>
+                <w:szCs w:val="26"/>
                 <w:lang w:eastAsia="en-IN"/>
                 <w14:ligatures w14:val="none"/>
               </w:rPr>
@@ -5109,6 +5241,8 @@
                 <w:rFonts w:ascii="Times New Roman" w:eastAsia="Times New Roman" w:hAnsi="Times New Roman" w:cs="Times New Roman"/>
                 <w:color w:val="1F1F1F"/>
                 <w:kern w:val="0"/>
+                <w:sz w:val="26"/>
+                <w:szCs w:val="26"/>
                 <w:bdr w:val="none" w:sz="0" w:space="0" w:color="auto" w:frame="1"/>
                 <w:lang w:eastAsia="en-IN"/>
                 <w14:ligatures w14:val="none"/>
@@ -5128,6 +5262,8 @@
                 <w:rFonts w:ascii="Times New Roman" w:eastAsia="Times New Roman" w:hAnsi="Times New Roman" w:cs="Times New Roman"/>
                 <w:color w:val="1F1F1F"/>
                 <w:kern w:val="0"/>
+                <w:sz w:val="26"/>
+                <w:szCs w:val="26"/>
                 <w:lang w:eastAsia="en-IN"/>
                 <w14:ligatures w14:val="none"/>
               </w:rPr>
@@ -5137,6 +5273,8 @@
                 <w:rFonts w:ascii="Times New Roman" w:eastAsia="Times New Roman" w:hAnsi="Times New Roman" w:cs="Times New Roman"/>
                 <w:color w:val="1F1F1F"/>
                 <w:kern w:val="0"/>
+                <w:sz w:val="26"/>
+                <w:szCs w:val="26"/>
                 <w:bdr w:val="none" w:sz="0" w:space="0" w:color="auto" w:frame="1"/>
                 <w:lang w:eastAsia="en-IN"/>
                 <w14:ligatures w14:val="none"/>
@@ -5157,6 +5295,8 @@
                 <w:rFonts w:ascii="Times New Roman" w:eastAsia="Times New Roman" w:hAnsi="Times New Roman" w:cs="Times New Roman"/>
                 <w:color w:val="1F1F1F"/>
                 <w:kern w:val="0"/>
+                <w:sz w:val="26"/>
+                <w:szCs w:val="26"/>
                 <w:lang w:eastAsia="en-IN"/>
                 <w14:ligatures w14:val="none"/>
               </w:rPr>
@@ -5166,6 +5306,8 @@
                 <w:rFonts w:ascii="Times New Roman" w:eastAsia="Times New Roman" w:hAnsi="Times New Roman" w:cs="Times New Roman"/>
                 <w:color w:val="1F1F1F"/>
                 <w:kern w:val="0"/>
+                <w:sz w:val="26"/>
+                <w:szCs w:val="26"/>
                 <w:lang w:eastAsia="en-IN"/>
                 <w14:ligatures w14:val="none"/>
               </w:rPr>
@@ -5186,6 +5328,8 @@
                 <w:rFonts w:ascii="Times New Roman" w:eastAsia="Times New Roman" w:hAnsi="Times New Roman" w:cs="Times New Roman"/>
                 <w:color w:val="1F1F1F"/>
                 <w:kern w:val="0"/>
+                <w:sz w:val="26"/>
+                <w:szCs w:val="26"/>
                 <w:lang w:eastAsia="en-IN"/>
                 <w14:ligatures w14:val="none"/>
               </w:rPr>
@@ -5195,6 +5339,8 @@
                 <w:rFonts w:ascii="Times New Roman" w:eastAsia="Times New Roman" w:hAnsi="Times New Roman" w:cs="Times New Roman"/>
                 <w:color w:val="1F1F1F"/>
                 <w:kern w:val="0"/>
+                <w:sz w:val="26"/>
+                <w:szCs w:val="26"/>
                 <w:bdr w:val="none" w:sz="0" w:space="0" w:color="auto" w:frame="1"/>
                 <w:lang w:eastAsia="en-IN"/>
                 <w14:ligatures w14:val="none"/>
@@ -5214,6 +5360,8 @@
                 <w:rFonts w:ascii="Times New Roman" w:eastAsia="Times New Roman" w:hAnsi="Times New Roman" w:cs="Times New Roman"/>
                 <w:color w:val="1F1F1F"/>
                 <w:kern w:val="0"/>
+                <w:sz w:val="26"/>
+                <w:szCs w:val="26"/>
                 <w:lang w:eastAsia="en-IN"/>
                 <w14:ligatures w14:val="none"/>
               </w:rPr>
@@ -5223,6 +5371,8 @@
                 <w:rFonts w:ascii="Times New Roman" w:eastAsia="Times New Roman" w:hAnsi="Times New Roman" w:cs="Times New Roman"/>
                 <w:color w:val="1F1F1F"/>
                 <w:kern w:val="0"/>
+                <w:sz w:val="26"/>
+                <w:szCs w:val="26"/>
                 <w:bdr w:val="none" w:sz="0" w:space="0" w:color="auto" w:frame="1"/>
                 <w:lang w:eastAsia="en-IN"/>
                 <w14:ligatures w14:val="none"/>
@@ -5243,6 +5393,8 @@
                 <w:rFonts w:ascii="Times New Roman" w:eastAsia="Times New Roman" w:hAnsi="Times New Roman" w:cs="Times New Roman"/>
                 <w:color w:val="1F1F1F"/>
                 <w:kern w:val="0"/>
+                <w:sz w:val="26"/>
+                <w:szCs w:val="26"/>
                 <w:lang w:eastAsia="en-IN"/>
                 <w14:ligatures w14:val="none"/>
               </w:rPr>
@@ -5252,6 +5404,8 @@
                 <w:rFonts w:ascii="Times New Roman" w:eastAsia="Times New Roman" w:hAnsi="Times New Roman" w:cs="Times New Roman"/>
                 <w:color w:val="1F1F1F"/>
                 <w:kern w:val="0"/>
+                <w:sz w:val="26"/>
+                <w:szCs w:val="26"/>
                 <w:lang w:eastAsia="en-IN"/>
                 <w14:ligatures w14:val="none"/>
               </w:rPr>
@@ -5272,6 +5426,8 @@
                 <w:rFonts w:ascii="Times New Roman" w:eastAsia="Times New Roman" w:hAnsi="Times New Roman" w:cs="Times New Roman"/>
                 <w:color w:val="1F1F1F"/>
                 <w:kern w:val="0"/>
+                <w:sz w:val="26"/>
+                <w:szCs w:val="26"/>
                 <w:lang w:eastAsia="en-IN"/>
                 <w14:ligatures w14:val="none"/>
               </w:rPr>
@@ -5281,6 +5437,8 @@
                 <w:rFonts w:ascii="Times New Roman" w:eastAsia="Times New Roman" w:hAnsi="Times New Roman" w:cs="Times New Roman"/>
                 <w:color w:val="1F1F1F"/>
                 <w:kern w:val="0"/>
+                <w:sz w:val="26"/>
+                <w:szCs w:val="26"/>
                 <w:bdr w:val="none" w:sz="0" w:space="0" w:color="auto" w:frame="1"/>
                 <w:lang w:eastAsia="en-IN"/>
                 <w14:ligatures w14:val="none"/>
@@ -5300,6 +5458,8 @@
                 <w:rFonts w:ascii="Times New Roman" w:eastAsia="Times New Roman" w:hAnsi="Times New Roman" w:cs="Times New Roman"/>
                 <w:color w:val="1F1F1F"/>
                 <w:kern w:val="0"/>
+                <w:sz w:val="26"/>
+                <w:szCs w:val="26"/>
                 <w:lang w:eastAsia="en-IN"/>
                 <w14:ligatures w14:val="none"/>
               </w:rPr>
@@ -5309,6 +5469,8 @@
                 <w:rFonts w:ascii="Times New Roman" w:eastAsia="Times New Roman" w:hAnsi="Times New Roman" w:cs="Times New Roman"/>
                 <w:color w:val="1F1F1F"/>
                 <w:kern w:val="0"/>
+                <w:sz w:val="26"/>
+                <w:szCs w:val="26"/>
                 <w:bdr w:val="none" w:sz="0" w:space="0" w:color="auto" w:frame="1"/>
                 <w:lang w:eastAsia="en-IN"/>
                 <w14:ligatures w14:val="none"/>
@@ -5329,6 +5491,8 @@
                 <w:rFonts w:ascii="Times New Roman" w:eastAsia="Times New Roman" w:hAnsi="Times New Roman" w:cs="Times New Roman"/>
                 <w:color w:val="1F1F1F"/>
                 <w:kern w:val="0"/>
+                <w:sz w:val="26"/>
+                <w:szCs w:val="26"/>
                 <w:lang w:eastAsia="en-IN"/>
                 <w14:ligatures w14:val="none"/>
               </w:rPr>
@@ -5338,6 +5502,8 @@
                 <w:rFonts w:ascii="Times New Roman" w:eastAsia="Times New Roman" w:hAnsi="Times New Roman" w:cs="Times New Roman"/>
                 <w:color w:val="1F1F1F"/>
                 <w:kern w:val="0"/>
+                <w:sz w:val="26"/>
+                <w:szCs w:val="26"/>
                 <w:lang w:eastAsia="en-IN"/>
                 <w14:ligatures w14:val="none"/>
               </w:rPr>
@@ -5358,6 +5524,8 @@
                 <w:rFonts w:ascii="Times New Roman" w:eastAsia="Times New Roman" w:hAnsi="Times New Roman" w:cs="Times New Roman"/>
                 <w:color w:val="1F1F1F"/>
                 <w:kern w:val="0"/>
+                <w:sz w:val="26"/>
+                <w:szCs w:val="26"/>
                 <w:lang w:eastAsia="en-IN"/>
                 <w14:ligatures w14:val="none"/>
               </w:rPr>
@@ -5367,6 +5535,8 @@
                 <w:rFonts w:ascii="Times New Roman" w:eastAsia="Times New Roman" w:hAnsi="Times New Roman" w:cs="Times New Roman"/>
                 <w:color w:val="1F1F1F"/>
                 <w:kern w:val="0"/>
+                <w:sz w:val="26"/>
+                <w:szCs w:val="26"/>
                 <w:bdr w:val="none" w:sz="0" w:space="0" w:color="auto" w:frame="1"/>
                 <w:lang w:eastAsia="en-IN"/>
                 <w14:ligatures w14:val="none"/>
@@ -5386,6 +5556,8 @@
                 <w:rFonts w:ascii="Times New Roman" w:eastAsia="Times New Roman" w:hAnsi="Times New Roman" w:cs="Times New Roman"/>
                 <w:color w:val="1F1F1F"/>
                 <w:kern w:val="0"/>
+                <w:sz w:val="26"/>
+                <w:szCs w:val="26"/>
                 <w:lang w:eastAsia="en-IN"/>
                 <w14:ligatures w14:val="none"/>
               </w:rPr>
@@ -5395,6 +5567,8 @@
                 <w:rFonts w:ascii="Times New Roman" w:eastAsia="Times New Roman" w:hAnsi="Times New Roman" w:cs="Times New Roman"/>
                 <w:color w:val="1F1F1F"/>
                 <w:kern w:val="0"/>
+                <w:sz w:val="26"/>
+                <w:szCs w:val="26"/>
                 <w:bdr w:val="none" w:sz="0" w:space="0" w:color="auto" w:frame="1"/>
                 <w:lang w:eastAsia="en-IN"/>
                 <w14:ligatures w14:val="none"/>
@@ -5415,6 +5589,8 @@
                 <w:rFonts w:ascii="Times New Roman" w:eastAsia="Times New Roman" w:hAnsi="Times New Roman" w:cs="Times New Roman"/>
                 <w:color w:val="1F1F1F"/>
                 <w:kern w:val="0"/>
+                <w:sz w:val="26"/>
+                <w:szCs w:val="26"/>
                 <w:lang w:eastAsia="en-IN"/>
                 <w14:ligatures w14:val="none"/>
               </w:rPr>
@@ -5424,6 +5600,8 @@
                 <w:rFonts w:ascii="Times New Roman" w:eastAsia="Times New Roman" w:hAnsi="Times New Roman" w:cs="Times New Roman"/>
                 <w:color w:val="1F1F1F"/>
                 <w:kern w:val="0"/>
+                <w:sz w:val="26"/>
+                <w:szCs w:val="26"/>
                 <w:lang w:eastAsia="en-IN"/>
                 <w14:ligatures w14:val="none"/>
               </w:rPr>
@@ -5444,6 +5622,8 @@
                 <w:rFonts w:ascii="Times New Roman" w:eastAsia="Times New Roman" w:hAnsi="Times New Roman" w:cs="Times New Roman"/>
                 <w:color w:val="1F1F1F"/>
                 <w:kern w:val="0"/>
+                <w:sz w:val="26"/>
+                <w:szCs w:val="26"/>
                 <w:lang w:eastAsia="en-IN"/>
                 <w14:ligatures w14:val="none"/>
               </w:rPr>
@@ -5453,6 +5633,8 @@
                 <w:rFonts w:ascii="Times New Roman" w:eastAsia="Times New Roman" w:hAnsi="Times New Roman" w:cs="Times New Roman"/>
                 <w:color w:val="1F1F1F"/>
                 <w:kern w:val="0"/>
+                <w:sz w:val="26"/>
+                <w:szCs w:val="26"/>
                 <w:bdr w:val="none" w:sz="0" w:space="0" w:color="auto" w:frame="1"/>
                 <w:lang w:eastAsia="en-IN"/>
                 <w14:ligatures w14:val="none"/>
@@ -5472,6 +5654,8 @@
                 <w:rFonts w:ascii="Times New Roman" w:eastAsia="Times New Roman" w:hAnsi="Times New Roman" w:cs="Times New Roman"/>
                 <w:color w:val="1F1F1F"/>
                 <w:kern w:val="0"/>
+                <w:sz w:val="26"/>
+                <w:szCs w:val="26"/>
                 <w:lang w:eastAsia="en-IN"/>
                 <w14:ligatures w14:val="none"/>
               </w:rPr>
@@ -5481,6 +5665,8 @@
                 <w:rFonts w:ascii="Times New Roman" w:eastAsia="Times New Roman" w:hAnsi="Times New Roman" w:cs="Times New Roman"/>
                 <w:color w:val="1F1F1F"/>
                 <w:kern w:val="0"/>
+                <w:sz w:val="26"/>
+                <w:szCs w:val="26"/>
                 <w:bdr w:val="none" w:sz="0" w:space="0" w:color="auto" w:frame="1"/>
                 <w:lang w:eastAsia="en-IN"/>
                 <w14:ligatures w14:val="none"/>
@@ -5501,6 +5687,8 @@
                 <w:rFonts w:ascii="Times New Roman" w:eastAsia="Times New Roman" w:hAnsi="Times New Roman" w:cs="Times New Roman"/>
                 <w:color w:val="1F1F1F"/>
                 <w:kern w:val="0"/>
+                <w:sz w:val="26"/>
+                <w:szCs w:val="26"/>
                 <w:lang w:eastAsia="en-IN"/>
                 <w14:ligatures w14:val="none"/>
               </w:rPr>
@@ -5510,6 +5698,8 @@
                 <w:rFonts w:ascii="Times New Roman" w:eastAsia="Times New Roman" w:hAnsi="Times New Roman" w:cs="Times New Roman"/>
                 <w:color w:val="1F1F1F"/>
                 <w:kern w:val="0"/>
+                <w:sz w:val="26"/>
+                <w:szCs w:val="26"/>
                 <w:lang w:eastAsia="en-IN"/>
                 <w14:ligatures w14:val="none"/>
               </w:rPr>
@@ -5528,7 +5718,7 @@
           <w:szCs w:val="26"/>
         </w:rPr>
         <w:sectPr>
-          <w:footerReference w:type="first" r:id="rId19"/>
+          <w:footerReference w:type="first" r:id="rId21"/>
           <w:pgSz w:w="11906" w:h="16838" w:code="9"/>
           <w:pgMar w:top="1440" w:right="567" w:bottom="1440" w:left="1701" w:header="709" w:footer="709" w:gutter="0"/>
           <w:pgNumType w:start="1"/>
@@ -5594,20 +5784,20 @@
           <w:szCs w:val="26"/>
         </w:rPr>
       </w:pPr>
-      <w:bookmarkStart w:id="1" w:name="_GoBack"/>
-      <w:bookmarkEnd w:id="1"/>
-    </w:p>
-    <w:p>
-      <w:pPr>
-        <w:rPr>
-          <w:rFonts w:ascii="Times New Roman" w:hAnsi="Times New Roman" w:cs="Times New Roman"/>
-          <w:sz w:val="26"/>
-          <w:szCs w:val="26"/>
-        </w:rPr>
-      </w:pPr>
-      <w:r>
-        <w:rPr>
-          <w:rFonts w:ascii="Times New Roman" w:hAnsi="Times New Roman" w:cs="Times New Roman"/>
+    </w:p>
+    <w:p>
+      <w:pPr>
+        <w:rPr>
+          <w:rFonts w:ascii="Times New Roman" w:hAnsi="Times New Roman" w:cs="Times New Roman"/>
+          <w:b/>
+          <w:sz w:val="26"/>
+          <w:szCs w:val="26"/>
+        </w:rPr>
+      </w:pPr>
+      <w:r>
+        <w:rPr>
+          <w:rFonts w:ascii="Times New Roman" w:hAnsi="Times New Roman" w:cs="Times New Roman"/>
+          <w:b/>
           <w:sz w:val="26"/>
           <w:szCs w:val="26"/>
         </w:rPr>
@@ -6077,13 +6267,15 @@
       <w:pPr>
         <w:rPr>
           <w:rFonts w:ascii="Times New Roman" w:hAnsi="Times New Roman" w:cs="Times New Roman"/>
-          <w:sz w:val="26"/>
-          <w:szCs w:val="26"/>
-        </w:rPr>
-      </w:pPr>
-      <w:r>
-        <w:rPr>
-          <w:rFonts w:ascii="Times New Roman" w:hAnsi="Times New Roman" w:cs="Times New Roman"/>
+          <w:b/>
+          <w:sz w:val="26"/>
+          <w:szCs w:val="26"/>
+        </w:rPr>
+      </w:pPr>
+      <w:r>
+        <w:rPr>
+          <w:rFonts w:ascii="Times New Roman" w:hAnsi="Times New Roman" w:cs="Times New Roman"/>
+          <w:b/>
           <w:sz w:val="26"/>
           <w:szCs w:val="26"/>
         </w:rPr>
@@ -7158,7 +7350,7 @@
           <w:sz w:val="26"/>
           <w:szCs w:val="26"/>
         </w:rPr>
-        <w:t>This research focus on Human-AI Teaming in cybersecurity positions the Sentinel Alert Triage Hub not merely as an alert ticket system, but as an **educational auditing platform** where analysts are systematically coached by AI feedback, managers gain qualitative oversight of team performance, and the institution builds institutional memory through a permanent, AI-reviewed audit trail of all triage decisions.</w:t>
+        <w:t>This research focus on Human-AI Teaming in cybersecurity positions the Sentinel Alert Triage Hub not merely as an alert ticket system, but as an educational auditing platform where analysts are systematically coached by AI feedback, managers gain qualitative oversight of team performance, and the institution builds institutional memory through a permanent, AI-reviewed audit trail of all triage decisions.</w:t>
       </w:r>
     </w:p>
     <w:p>
@@ -8209,13 +8401,15 @@
       <w:pPr>
         <w:rPr>
           <w:rFonts w:ascii="Times New Roman" w:hAnsi="Times New Roman" w:cs="Times New Roman"/>
-          <w:sz w:val="26"/>
-          <w:szCs w:val="26"/>
-        </w:rPr>
-      </w:pPr>
-      <w:r>
-        <w:rPr>
-          <w:rFonts w:ascii="Times New Roman" w:hAnsi="Times New Roman" w:cs="Times New Roman"/>
+          <w:b/>
+          <w:sz w:val="26"/>
+          <w:szCs w:val="26"/>
+        </w:rPr>
+      </w:pPr>
+      <w:r>
+        <w:rPr>
+          <w:rFonts w:ascii="Times New Roman" w:hAnsi="Times New Roman" w:cs="Times New Roman"/>
+          <w:b/>
           <w:sz w:val="26"/>
           <w:szCs w:val="26"/>
         </w:rPr>
@@ -8577,13 +8771,15 @@
       <w:pPr>
         <w:rPr>
           <w:rFonts w:ascii="Times New Roman" w:hAnsi="Times New Roman" w:cs="Times New Roman"/>
-          <w:sz w:val="26"/>
-          <w:szCs w:val="26"/>
-        </w:rPr>
-      </w:pPr>
-      <w:r>
-        <w:rPr>
-          <w:rFonts w:ascii="Times New Roman" w:hAnsi="Times New Roman" w:cs="Times New Roman"/>
+          <w:b/>
+          <w:sz w:val="26"/>
+          <w:szCs w:val="26"/>
+        </w:rPr>
+      </w:pPr>
+      <w:r>
+        <w:rPr>
+          <w:rFonts w:ascii="Times New Roman" w:hAnsi="Times New Roman" w:cs="Times New Roman"/>
+          <w:b/>
           <w:sz w:val="26"/>
           <w:szCs w:val="26"/>
         </w:rPr>
@@ -9060,351 +9256,6 @@
           <w:szCs w:val="26"/>
         </w:rPr>
       </w:pPr>
-    </w:p>
-    <w:p>
-      <w:pPr>
-        <w:rPr>
-          <w:rFonts w:ascii="Times New Roman" w:hAnsi="Times New Roman" w:cs="Times New Roman"/>
-          <w:sz w:val="26"/>
-          <w:szCs w:val="26"/>
-        </w:rPr>
-      </w:pPr>
-      <w:r>
-        <w:rPr>
-          <w:rFonts w:ascii="Times New Roman" w:hAnsi="Times New Roman" w:cs="Times New Roman"/>
-          <w:sz w:val="26"/>
-          <w:szCs w:val="26"/>
-        </w:rPr>
-        <w:t>References</w:t>
-      </w:r>
-    </w:p>
-    <w:p>
-      <w:pPr>
-        <w:rPr>
-          <w:rFonts w:ascii="Times New Roman" w:hAnsi="Times New Roman" w:cs="Times New Roman"/>
-          <w:sz w:val="26"/>
-          <w:szCs w:val="26"/>
-        </w:rPr>
-      </w:pPr>
-    </w:p>
-    <w:p>
-      <w:pPr>
-        <w:rPr>
-          <w:rFonts w:ascii="Times New Roman" w:hAnsi="Times New Roman" w:cs="Times New Roman"/>
-          <w:sz w:val="26"/>
-          <w:szCs w:val="26"/>
-        </w:rPr>
-      </w:pPr>
-      <w:r>
-        <w:rPr>
-          <w:rFonts w:ascii="Times New Roman" w:hAnsi="Times New Roman" w:cs="Times New Roman"/>
-          <w:sz w:val="26"/>
-          <w:szCs w:val="26"/>
-        </w:rPr>
-        <w:t>All papers cited in this documentation. Papers are listed in order of first citation within the document.</w:t>
-      </w:r>
-    </w:p>
-    <w:p>
-      <w:pPr>
-        <w:rPr>
-          <w:rFonts w:ascii="Times New Roman" w:hAnsi="Times New Roman" w:cs="Times New Roman"/>
-          <w:sz w:val="26"/>
-          <w:szCs w:val="26"/>
-        </w:rPr>
-      </w:pPr>
-    </w:p>
-    <w:p>
-      <w:pPr>
-        <w:rPr>
-          <w:rFonts w:ascii="Times New Roman" w:hAnsi="Times New Roman" w:cs="Times New Roman"/>
-          <w:sz w:val="26"/>
-          <w:szCs w:val="26"/>
-        </w:rPr>
-      </w:pPr>
-      <w:r>
-        <w:rPr>
-          <w:rFonts w:ascii="Times New Roman" w:hAnsi="Times New Roman" w:cs="Times New Roman"/>
-          <w:sz w:val="26"/>
-          <w:szCs w:val="26"/>
-        </w:rPr>
-        <w:t>1. Subrahmanian, V. S., et al. (2021). *Towards a Systematic Approach to Alert Management in Security Operations Centers.* ACM Transactions on Privacy and Security (TOPS), Vol. 24, No. 2. https://dl.acm.org/doi/10.1145/3450965</w:t>
-      </w:r>
-    </w:p>
-    <w:p>
-      <w:pPr>
-        <w:rPr>
-          <w:rFonts w:ascii="Times New Roman" w:hAnsi="Times New Roman" w:cs="Times New Roman"/>
-          <w:sz w:val="26"/>
-          <w:szCs w:val="26"/>
-        </w:rPr>
-      </w:pPr>
-    </w:p>
-    <w:p>
-      <w:pPr>
-        <w:rPr>
-          <w:rFonts w:ascii="Times New Roman" w:hAnsi="Times New Roman" w:cs="Times New Roman"/>
-          <w:sz w:val="26"/>
-          <w:szCs w:val="26"/>
-        </w:rPr>
-        <w:sectPr>
-          <w:pgSz w:w="11906" w:h="16838" w:code="9"/>
-          <w:pgMar w:top="1440" w:right="567" w:bottom="1440" w:left="1701" w:header="709" w:footer="709" w:gutter="0"/>
-          <w:cols w:space="708"/>
-          <w:titlePg/>
-          <w:docGrid w:linePitch="360"/>
-        </w:sectPr>
-      </w:pPr>
-      <w:r>
-        <w:rPr>
-          <w:rFonts w:ascii="Times New Roman" w:hAnsi="Times New Roman" w:cs="Times New Roman"/>
-          <w:sz w:val="26"/>
-          <w:szCs w:val="26"/>
-        </w:rPr>
-        <w:t xml:space="preserve">2. Veeramachaneni, K., Arnaldo, I., Cuesta-Infante, A., Lam, V., &amp; Cito, J. (2022). *AACT: Automated Alert Classification and Triage Using Machine Learning in Enterprise Security </w:t>
-      </w:r>
-    </w:p>
-    <w:p>
-      <w:pPr>
-        <w:rPr>
-          <w:rFonts w:ascii="Times New Roman" w:hAnsi="Times New Roman" w:cs="Times New Roman"/>
-          <w:sz w:val="26"/>
-          <w:szCs w:val="26"/>
-        </w:rPr>
-      </w:pPr>
-      <w:r>
-        <w:rPr>
-          <w:rFonts w:ascii="Times New Roman" w:hAnsi="Times New Roman" w:cs="Times New Roman"/>
-          <w:sz w:val="26"/>
-          <w:szCs w:val="26"/>
-        </w:rPr>
-        <w:lastRenderedPageBreak/>
-        <w:t>Operations Centers.* Network and Distributed System Security (NDSS) Symposium 2022. https://www.ndss-symposium.org/</w:t>
-      </w:r>
-    </w:p>
-    <w:p>
-      <w:pPr>
-        <w:rPr>
-          <w:rFonts w:ascii="Times New Roman" w:hAnsi="Times New Roman" w:cs="Times New Roman"/>
-          <w:sz w:val="26"/>
-          <w:szCs w:val="26"/>
-        </w:rPr>
-      </w:pPr>
-    </w:p>
-    <w:p>
-      <w:pPr>
-        <w:rPr>
-          <w:rFonts w:ascii="Times New Roman" w:hAnsi="Times New Roman" w:cs="Times New Roman"/>
-          <w:sz w:val="26"/>
-          <w:szCs w:val="26"/>
-        </w:rPr>
-      </w:pPr>
-      <w:r>
-        <w:rPr>
-          <w:rFonts w:ascii="Times New Roman" w:hAnsi="Times New Roman" w:cs="Times New Roman"/>
-          <w:sz w:val="26"/>
-          <w:szCs w:val="26"/>
-        </w:rPr>
-        <w:t>3. Al-Mohannadi, H., Awan, I., Al Hamar, J., Al Hamar, Y., &amp; Ismail, L. (2022). *The Impact of Security Orchestration, Automation, and Response (SOAR) on Security Operations Center (SOC) Efficiency: A Comprehensive Analysis.* Turkish Journal of Computer and Mathematics Education, Vol. 10, No. 3. https://doi.org/10.61841/turcomat.v10i3.14323</w:t>
-      </w:r>
-    </w:p>
-    <w:p>
-      <w:pPr>
-        <w:rPr>
-          <w:rFonts w:ascii="Times New Roman" w:hAnsi="Times New Roman" w:cs="Times New Roman"/>
-          <w:sz w:val="26"/>
-          <w:szCs w:val="26"/>
-        </w:rPr>
-      </w:pPr>
-    </w:p>
-    <w:p>
-      <w:pPr>
-        <w:rPr>
-          <w:rFonts w:ascii="Times New Roman" w:hAnsi="Times New Roman" w:cs="Times New Roman"/>
-          <w:sz w:val="26"/>
-          <w:szCs w:val="26"/>
-        </w:rPr>
-      </w:pPr>
-      <w:r>
-        <w:rPr>
-          <w:rFonts w:ascii="Times New Roman" w:hAnsi="Times New Roman" w:cs="Times New Roman"/>
-          <w:sz w:val="26"/>
-          <w:szCs w:val="26"/>
-        </w:rPr>
-        <w:t>4. Aghaei, E., Niu, X., Shadid, W., &amp; Al-Shaer, E. (2023). *SecureBERT: A Domain-Specific Language Model for Cybersecurity.* arXiv preprint arXiv:2204.02685. https://arxiv.org/abs/2204.02685</w:t>
-      </w:r>
-    </w:p>
-    <w:p>
-      <w:pPr>
-        <w:rPr>
-          <w:rFonts w:ascii="Times New Roman" w:hAnsi="Times New Roman" w:cs="Times New Roman"/>
-          <w:sz w:val="26"/>
-          <w:szCs w:val="26"/>
-        </w:rPr>
-      </w:pPr>
-    </w:p>
-    <w:p>
-      <w:pPr>
-        <w:rPr>
-          <w:rFonts w:ascii="Times New Roman" w:hAnsi="Times New Roman" w:cs="Times New Roman"/>
-          <w:sz w:val="26"/>
-          <w:szCs w:val="26"/>
-        </w:rPr>
-      </w:pPr>
-      <w:r>
-        <w:rPr>
-          <w:rFonts w:ascii="Times New Roman" w:hAnsi="Times New Roman" w:cs="Times New Roman"/>
-          <w:sz w:val="26"/>
-          <w:szCs w:val="26"/>
-        </w:rPr>
-        <w:t>5. Deng, G., Liu, Y., Mayoral-Vilches, V., Liu, P., Li, Y., Xu, Y., Zhang, T., Liu, Y., Pinzger, M., &amp; Rass, S. (2024). *PentestGPT: Evaluating and Harnessing Large Language Models for Automated Penetration Testing.* Proceedings of the 33rd USENIX Security Symposium. arXiv:2308.06782. https://arxiv.org/abs/2308.06782</w:t>
-      </w:r>
-    </w:p>
-    <w:p>
-      <w:pPr>
-        <w:rPr>
-          <w:rFonts w:ascii="Times New Roman" w:hAnsi="Times New Roman" w:cs="Times New Roman"/>
-          <w:sz w:val="26"/>
-          <w:szCs w:val="26"/>
-        </w:rPr>
-      </w:pPr>
-    </w:p>
-    <w:p>
-      <w:pPr>
-        <w:rPr>
-          <w:rFonts w:ascii="Times New Roman" w:hAnsi="Times New Roman" w:cs="Times New Roman"/>
-          <w:sz w:val="26"/>
-          <w:szCs w:val="26"/>
-        </w:rPr>
-      </w:pPr>
-      <w:r>
-        <w:rPr>
-          <w:rFonts w:ascii="Times New Roman" w:hAnsi="Times New Roman" w:cs="Times New Roman"/>
-          <w:sz w:val="26"/>
-          <w:szCs w:val="26"/>
-        </w:rPr>
-        <w:t>6. Osei-Bonsu, K., Asante, M., &amp; Boateng, E. O. (2025). *Streamlining Threat Response and Automating Critical Use Cases with Security Orchestration, Automation and Response (SOAR).* Digital Security and Forensics Journal, Vol. 2, No. 1. https://doi.org/10.29121/digisecforensics.v2.i1.2025.45</w:t>
-      </w:r>
-    </w:p>
-    <w:p>
-      <w:pPr>
-        <w:rPr>
-          <w:rFonts w:ascii="Times New Roman" w:hAnsi="Times New Roman" w:cs="Times New Roman"/>
-          <w:sz w:val="26"/>
-          <w:szCs w:val="26"/>
-        </w:rPr>
-      </w:pPr>
-    </w:p>
-    <w:p>
-      <w:pPr>
-        <w:rPr>
-          <w:rFonts w:ascii="Times New Roman" w:hAnsi="Times New Roman" w:cs="Times New Roman"/>
-          <w:sz w:val="26"/>
-          <w:szCs w:val="26"/>
-        </w:rPr>
-      </w:pPr>
-      <w:r>
-        <w:rPr>
-          <w:rFonts w:ascii="Times New Roman" w:hAnsi="Times New Roman" w:cs="Times New Roman"/>
-          <w:sz w:val="26"/>
-          <w:szCs w:val="26"/>
-        </w:rPr>
-        <w:t>7. Xiong, W., &amp; Lagerström, R. (2022). *Threat Modeling and Explainability in AI-Driven Security Systems: A Survey of Human-AI Trust and Decision Support.* Computers &amp; Security, Vol. 120. https://doi.org/10.1016/j.cose.2022.102810</w:t>
-      </w:r>
-    </w:p>
-    <w:p>
-      <w:pPr>
-        <w:rPr>
-          <w:rFonts w:ascii="Times New Roman" w:hAnsi="Times New Roman" w:cs="Times New Roman"/>
-          <w:sz w:val="26"/>
-          <w:szCs w:val="26"/>
-        </w:rPr>
-      </w:pPr>
-    </w:p>
-    <w:p>
-      <w:pPr>
-        <w:rPr>
-          <w:rFonts w:ascii="Times New Roman" w:hAnsi="Times New Roman" w:cs="Times New Roman"/>
-          <w:sz w:val="26"/>
-          <w:szCs w:val="26"/>
-        </w:rPr>
-      </w:pPr>
-      <w:r>
-        <w:rPr>
-          <w:rFonts w:ascii="Times New Roman" w:hAnsi="Times New Roman" w:cs="Times New Roman"/>
-          <w:sz w:val="26"/>
-          <w:szCs w:val="26"/>
-        </w:rPr>
-        <w:t>8. Husák, M., Čegan, J., Vykopal, J., &amp; Čeleda, P. (2022). *Reducing Alert Fatigue in Security Operations: A Contextual Prioritization Framework.* IEEE Transactions on Network and Service Management, Vol. 19, No. 3. https://ieeexplore.ieee.org/</w:t>
-      </w:r>
-    </w:p>
-    <w:p>
-      <w:pPr>
-        <w:rPr>
-          <w:rFonts w:ascii="Times New Roman" w:hAnsi="Times New Roman" w:cs="Times New Roman"/>
-          <w:sz w:val="26"/>
-          <w:szCs w:val="26"/>
-        </w:rPr>
-      </w:pPr>
-    </w:p>
-    <w:p>
-      <w:pPr>
-        <w:rPr>
-          <w:rFonts w:ascii="Times New Roman" w:hAnsi="Times New Roman" w:cs="Times New Roman"/>
-          <w:sz w:val="26"/>
-          <w:szCs w:val="26"/>
-        </w:rPr>
-        <w:sectPr>
-          <w:pgSz w:w="11906" w:h="16838" w:code="9"/>
-          <w:pgMar w:top="1440" w:right="567" w:bottom="1440" w:left="1701" w:header="709" w:footer="709" w:gutter="0"/>
-          <w:cols w:space="708"/>
-          <w:titlePg/>
-          <w:docGrid w:linePitch="360"/>
-        </w:sectPr>
-      </w:pPr>
-    </w:p>
-    <w:p>
-      <w:pPr>
-        <w:rPr>
-          <w:rFonts w:ascii="Times New Roman" w:hAnsi="Times New Roman" w:cs="Times New Roman"/>
-          <w:sz w:val="26"/>
-          <w:szCs w:val="26"/>
-        </w:rPr>
-      </w:pPr>
-      <w:r>
-        <w:rPr>
-          <w:rFonts w:ascii="Times New Roman" w:hAnsi="Times New Roman" w:cs="Times New Roman"/>
-          <w:sz w:val="26"/>
-          <w:szCs w:val="26"/>
-        </w:rPr>
-        <w:lastRenderedPageBreak/>
-        <w:t>9. Ibrahim, A., Hassan, M., &amp; Al-Qatawneh, S. (2023). *A Federated Adaptive Contextual Prioritization Framework (FACPF) for Privacy-Preserving SOC Threat Management.* OSF Preprints. https://osf.io/</w:t>
-      </w:r>
-    </w:p>
-    <w:p>
-      <w:pPr>
-        <w:rPr>
-          <w:rFonts w:ascii="Times New Roman" w:hAnsi="Times New Roman" w:cs="Times New Roman"/>
-          <w:sz w:val="26"/>
-          <w:szCs w:val="26"/>
-        </w:rPr>
-      </w:pPr>
-    </w:p>
-    <w:p>
-      <w:pPr>
-        <w:rPr>
-          <w:rFonts w:ascii="Times New Roman" w:hAnsi="Times New Roman" w:cs="Times New Roman"/>
-          <w:sz w:val="26"/>
-          <w:szCs w:val="26"/>
-        </w:rPr>
-      </w:pPr>
-      <w:r>
-        <w:rPr>
-          <w:rFonts w:ascii="Times New Roman" w:hAnsi="Times New Roman" w:cs="Times New Roman"/>
-          <w:sz w:val="26"/>
-          <w:szCs w:val="26"/>
-        </w:rPr>
-        <w:t>10. Park, J., Kim, S., &amp; Lee, H. (2024). *LLM Agents for Autonomous Security Operations: Reasoning, Acting, and Tool Use in SOC Environments.* Proceedings of the ACM CCS Workshop on AI-Powered Security (AISec 2024). https://dl.acm.org/doi/proceedings/10.1145/3689217</w:t>
-      </w:r>
     </w:p>
     <w:sectPr>
       <w:pgSz w:w="11906" w:h="16838" w:code="9"/>
@@ -9443,6 +9294,16 @@
 </file>
 
 <file path=word/footer1.xml><?xml version="1.0" encoding="utf-8"?>
+<w:ftr xmlns:wpc="http://schemas.microsoft.com/office/word/2010/wordprocessingCanvas" xmlns:cx="http://schemas.microsoft.com/office/drawing/2014/chartex" xmlns:cx1="http://schemas.microsoft.com/office/drawing/2015/9/8/chartex" xmlns:cx2="http://schemas.microsoft.com/office/drawing/2015/10/21/chartex" xmlns:cx3="http://schemas.microsoft.com/office/drawing/2016/5/9/chartex" xmlns:cx4="http://schemas.microsoft.com/office/drawing/2016/5/10/chartex" xmlns:cx5="http://schemas.microsoft.com/office/drawing/2016/5/11/chartex" xmlns:cx6="http://schemas.microsoft.com/office/drawing/2016/5/12/chartex" xmlns:cx7="http://schemas.microsoft.com/office/drawing/2016/5/13/chartex" xmlns:cx8="http://schemas.microsoft.com/office/drawing/2016/5/14/chartex" xmlns:mc="http://schemas.openxmlformats.org/markup-compatibility/2006" xmlns:aink="http://schemas.microsoft.com/office/drawing/2016/ink" xmlns:am3d="http://schemas.microsoft.com/office/drawing/2017/model3d" xmlns:o="urn:schemas-microsoft-com:office:office" xmlns:r="http://schemas.openxmlformats.org/officeDocument/2006/relationships" xmlns:m="http://schemas.openxmlformats.org/officeDocument/2006/math" xmlns:v="urn:schemas-microsoft-com:vml" xmlns:wp14="http://schemas.microsoft.com/office/word/2010/wordprocessingDrawing" xmlns:wp="http://schemas.openxmlformats.org/drawingml/2006/wordprocessingDrawing" xmlns:w10="urn:schemas-microsoft-com:office:word" xmlns:w="http://schemas.openxmlformats.org/wordprocessingml/2006/main" xmlns:w14="http://schemas.microsoft.com/office/word/2010/wordml" xmlns:w15="http://schemas.microsoft.com/office/word/2012/wordml" xmlns:w16cid="http://schemas.microsoft.com/office/word/2016/wordml/cid" xmlns:w16se="http://schemas.microsoft.com/office/word/2015/wordml/symex" xmlns:wpg="http://schemas.microsoft.com/office/word/2010/wordprocessingGroup" xmlns:wpi="http://schemas.microsoft.com/office/word/2010/wordprocessingInk" xmlns:wne="http://schemas.microsoft.com/office/word/2006/wordml" xmlns:wps="http://schemas.microsoft.com/office/word/2010/wordprocessingShape" mc:Ignorable="w14 w15 w16se w16cid wp14">
+  <w:p>
+    <w:pPr>
+      <w:pStyle w:val="Footer"/>
+    </w:pPr>
+  </w:p>
+</w:ftr>
+</file>
+
+<file path=word/footer2.xml><?xml version="1.0" encoding="utf-8"?>
 <w:ftr xmlns:wpc="http://schemas.microsoft.com/office/word/2010/wordprocessingCanvas" xmlns:cx="http://schemas.microsoft.com/office/drawing/2014/chartex" xmlns:cx1="http://schemas.microsoft.com/office/drawing/2015/9/8/chartex" xmlns:cx2="http://schemas.microsoft.com/office/drawing/2015/10/21/chartex" xmlns:cx3="http://schemas.microsoft.com/office/drawing/2016/5/9/chartex" xmlns:cx4="http://schemas.microsoft.com/office/drawing/2016/5/10/chartex" xmlns:cx5="http://schemas.microsoft.com/office/drawing/2016/5/11/chartex" xmlns:cx6="http://schemas.microsoft.com/office/drawing/2016/5/12/chartex" xmlns:cx7="http://schemas.microsoft.com/office/drawing/2016/5/13/chartex" xmlns:cx8="http://schemas.microsoft.com/office/drawing/2016/5/14/chartex" xmlns:mc="http://schemas.openxmlformats.org/markup-compatibility/2006" xmlns:aink="http://schemas.microsoft.com/office/drawing/2016/ink" xmlns:am3d="http://schemas.microsoft.com/office/drawing/2017/model3d" xmlns:o="urn:schemas-microsoft-com:office:office" xmlns:r="http://schemas.openxmlformats.org/officeDocument/2006/relationships" xmlns:m="http://schemas.openxmlformats.org/officeDocument/2006/math" xmlns:v="urn:schemas-microsoft-com:vml" xmlns:wp14="http://schemas.microsoft.com/office/word/2010/wordprocessingDrawing" xmlns:wp="http://schemas.openxmlformats.org/drawingml/2006/wordprocessingDrawing" xmlns:w10="urn:schemas-microsoft-com:office:word" xmlns:w="http://schemas.openxmlformats.org/wordprocessingml/2006/main" xmlns:w14="http://schemas.microsoft.com/office/word/2010/wordml" xmlns:w15="http://schemas.microsoft.com/office/word/2012/wordml" xmlns:w16cid="http://schemas.microsoft.com/office/word/2016/wordml/cid" xmlns:w16se="http://schemas.microsoft.com/office/word/2015/wordml/symex" xmlns:wpg="http://schemas.microsoft.com/office/word/2010/wordprocessingGroup" xmlns:wpi="http://schemas.microsoft.com/office/word/2010/wordprocessingInk" xmlns:wne="http://schemas.microsoft.com/office/word/2006/wordml" xmlns:wps="http://schemas.microsoft.com/office/word/2010/wordprocessingShape" mc:Ignorable="w14 w15 w16se w16cid wp14">
   <w:sdt>
     <w:sdtPr>
@@ -9474,7 +9335,7 @@
 </w:ftr>
 </file>
 
-<file path=word/footer2.xml><?xml version="1.0" encoding="utf-8"?>
+<file path=word/footer3.xml><?xml version="1.0" encoding="utf-8"?>
 <w:ftr xmlns:wpc="http://schemas.microsoft.com/office/word/2010/wordprocessingCanvas" xmlns:cx="http://schemas.microsoft.com/office/drawing/2014/chartex" xmlns:cx1="http://schemas.microsoft.com/office/drawing/2015/9/8/chartex" xmlns:cx2="http://schemas.microsoft.com/office/drawing/2015/10/21/chartex" xmlns:cx3="http://schemas.microsoft.com/office/drawing/2016/5/9/chartex" xmlns:cx4="http://schemas.microsoft.com/office/drawing/2016/5/10/chartex" xmlns:cx5="http://schemas.microsoft.com/office/drawing/2016/5/11/chartex" xmlns:cx6="http://schemas.microsoft.com/office/drawing/2016/5/12/chartex" xmlns:cx7="http://schemas.microsoft.com/office/drawing/2016/5/13/chartex" xmlns:cx8="http://schemas.microsoft.com/office/drawing/2016/5/14/chartex" xmlns:mc="http://schemas.openxmlformats.org/markup-compatibility/2006" xmlns:aink="http://schemas.microsoft.com/office/drawing/2016/ink" xmlns:am3d="http://schemas.microsoft.com/office/drawing/2017/model3d" xmlns:o="urn:schemas-microsoft-com:office:office" xmlns:r="http://schemas.openxmlformats.org/officeDocument/2006/relationships" xmlns:m="http://schemas.openxmlformats.org/officeDocument/2006/math" xmlns:v="urn:schemas-microsoft-com:vml" xmlns:wp14="http://schemas.microsoft.com/office/word/2010/wordprocessingDrawing" xmlns:wp="http://schemas.openxmlformats.org/drawingml/2006/wordprocessingDrawing" xmlns:w10="urn:schemas-microsoft-com:office:word" xmlns:w="http://schemas.openxmlformats.org/wordprocessingml/2006/main" xmlns:w14="http://schemas.microsoft.com/office/word/2010/wordml" xmlns:w15="http://schemas.microsoft.com/office/word/2012/wordml" xmlns:w16cid="http://schemas.microsoft.com/office/word/2016/wordml/cid" xmlns:w16se="http://schemas.microsoft.com/office/word/2015/wordml/symex" xmlns:wpg="http://schemas.microsoft.com/office/word/2010/wordprocessingGroup" xmlns:wpi="http://schemas.microsoft.com/office/word/2010/wordprocessingInk" xmlns:wne="http://schemas.microsoft.com/office/word/2006/wordml" xmlns:wps="http://schemas.microsoft.com/office/word/2010/wordprocessingShape" mc:Ignorable="w14 w15 w16se w16cid wp14">
   <w:sdt>
     <w:sdtPr>
@@ -9495,28 +9356,9 @@
           <w:pStyle w:val="Footer"/>
           <w:jc w:val="right"/>
         </w:pPr>
-        <w:r>
-          <w:fldChar w:fldCharType="begin"/>
-        </w:r>
-        <w:r>
-          <w:instrText xml:space="preserve"> PAGE   \* MERGEFORMAT </w:instrText>
-        </w:r>
-        <w:r>
-          <w:fldChar w:fldCharType="separate"/>
-        </w:r>
-        <w:r>
-          <w:rPr>
-            <w:noProof/>
-          </w:rPr>
-          <w:t>2</w:t>
-        </w:r>
-        <w:r>
-          <w:rPr>
-            <w:noProof/>
-          </w:rPr>
-          <w:fldChar w:fldCharType="end"/>
-        </w:r>
       </w:p>
+      <w:bookmarkStart w:id="0" w:name="_GoBack" w:displacedByCustomXml="next"/>
+      <w:bookmarkEnd w:id="0" w:displacedByCustomXml="next"/>
     </w:sdtContent>
   </w:sdt>
   <w:p>
@@ -9527,7 +9369,7 @@
 </w:ftr>
 </file>
 
-<file path=word/footer3.xml><?xml version="1.0" encoding="utf-8"?>
+<file path=word/footer4.xml><?xml version="1.0" encoding="utf-8"?>
 <w:ftr xmlns:wpc="http://schemas.microsoft.com/office/word/2010/wordprocessingCanvas" xmlns:cx="http://schemas.microsoft.com/office/drawing/2014/chartex" xmlns:cx1="http://schemas.microsoft.com/office/drawing/2015/9/8/chartex" xmlns:cx2="http://schemas.microsoft.com/office/drawing/2015/10/21/chartex" xmlns:cx3="http://schemas.microsoft.com/office/drawing/2016/5/9/chartex" xmlns:cx4="http://schemas.microsoft.com/office/drawing/2016/5/10/chartex" xmlns:cx5="http://schemas.microsoft.com/office/drawing/2016/5/11/chartex" xmlns:cx6="http://schemas.microsoft.com/office/drawing/2016/5/12/chartex" xmlns:cx7="http://schemas.microsoft.com/office/drawing/2016/5/13/chartex" xmlns:cx8="http://schemas.microsoft.com/office/drawing/2016/5/14/chartex" xmlns:mc="http://schemas.openxmlformats.org/markup-compatibility/2006" xmlns:aink="http://schemas.microsoft.com/office/drawing/2016/ink" xmlns:am3d="http://schemas.microsoft.com/office/drawing/2017/model3d" xmlns:o="urn:schemas-microsoft-com:office:office" xmlns:r="http://schemas.openxmlformats.org/officeDocument/2006/relationships" xmlns:m="http://schemas.openxmlformats.org/officeDocument/2006/math" xmlns:v="urn:schemas-microsoft-com:vml" xmlns:wp14="http://schemas.microsoft.com/office/word/2010/wordprocessingDrawing" xmlns:wp="http://schemas.openxmlformats.org/drawingml/2006/wordprocessingDrawing" xmlns:w10="urn:schemas-microsoft-com:office:word" xmlns:w="http://schemas.openxmlformats.org/wordprocessingml/2006/main" xmlns:w14="http://schemas.microsoft.com/office/word/2010/wordml" xmlns:w15="http://schemas.microsoft.com/office/word/2012/wordml" xmlns:w16cid="http://schemas.microsoft.com/office/word/2016/wordml/cid" xmlns:w16se="http://schemas.microsoft.com/office/word/2015/wordml/symex" xmlns:wpg="http://schemas.microsoft.com/office/word/2010/wordprocessingGroup" xmlns:wpi="http://schemas.microsoft.com/office/word/2010/wordprocessingInk" xmlns:wne="http://schemas.microsoft.com/office/word/2006/wordml" xmlns:wps="http://schemas.microsoft.com/office/word/2010/wordprocessingShape" mc:Ignorable="w14 w15 w16se w16cid wp14">
   <w:sdt>
     <w:sdtPr>
@@ -9603,6 +9445,36 @@
     </w:p>
   </w:footnote>
 </w:footnotes>
+</file>
+
+<file path=word/header1.xml><?xml version="1.0" encoding="utf-8"?>
+<w:hdr xmlns:wpc="http://schemas.microsoft.com/office/word/2010/wordprocessingCanvas" xmlns:cx="http://schemas.microsoft.com/office/drawing/2014/chartex" xmlns:cx1="http://schemas.microsoft.com/office/drawing/2015/9/8/chartex" xmlns:cx2="http://schemas.microsoft.com/office/drawing/2015/10/21/chartex" xmlns:cx3="http://schemas.microsoft.com/office/drawing/2016/5/9/chartex" xmlns:cx4="http://schemas.microsoft.com/office/drawing/2016/5/10/chartex" xmlns:cx5="http://schemas.microsoft.com/office/drawing/2016/5/11/chartex" xmlns:cx6="http://schemas.microsoft.com/office/drawing/2016/5/12/chartex" xmlns:cx7="http://schemas.microsoft.com/office/drawing/2016/5/13/chartex" xmlns:cx8="http://schemas.microsoft.com/office/drawing/2016/5/14/chartex" xmlns:mc="http://schemas.openxmlformats.org/markup-compatibility/2006" xmlns:aink="http://schemas.microsoft.com/office/drawing/2016/ink" xmlns:am3d="http://schemas.microsoft.com/office/drawing/2017/model3d" xmlns:o="urn:schemas-microsoft-com:office:office" xmlns:r="http://schemas.openxmlformats.org/officeDocument/2006/relationships" xmlns:m="http://schemas.openxmlformats.org/officeDocument/2006/math" xmlns:v="urn:schemas-microsoft-com:vml" xmlns:wp14="http://schemas.microsoft.com/office/word/2010/wordprocessingDrawing" xmlns:wp="http://schemas.openxmlformats.org/drawingml/2006/wordprocessingDrawing" xmlns:w10="urn:schemas-microsoft-com:office:word" xmlns:w="http://schemas.openxmlformats.org/wordprocessingml/2006/main" xmlns:w14="http://schemas.microsoft.com/office/word/2010/wordml" xmlns:w15="http://schemas.microsoft.com/office/word/2012/wordml" xmlns:w16cid="http://schemas.microsoft.com/office/word/2016/wordml/cid" xmlns:w16se="http://schemas.microsoft.com/office/word/2015/wordml/symex" xmlns:wpg="http://schemas.microsoft.com/office/word/2010/wordprocessingGroup" xmlns:wpi="http://schemas.microsoft.com/office/word/2010/wordprocessingInk" xmlns:wne="http://schemas.microsoft.com/office/word/2006/wordml" xmlns:wps="http://schemas.microsoft.com/office/word/2010/wordprocessingShape" mc:Ignorable="w14 w15 w16se w16cid wp14">
+  <w:p>
+    <w:pPr>
+      <w:pStyle w:val="Header"/>
+    </w:pPr>
+  </w:p>
+</w:hdr>
+</file>
+
+<file path=word/header2.xml><?xml version="1.0" encoding="utf-8"?>
+<w:hdr xmlns:wpc="http://schemas.microsoft.com/office/word/2010/wordprocessingCanvas" xmlns:cx="http://schemas.microsoft.com/office/drawing/2014/chartex" xmlns:cx1="http://schemas.microsoft.com/office/drawing/2015/9/8/chartex" xmlns:cx2="http://schemas.microsoft.com/office/drawing/2015/10/21/chartex" xmlns:cx3="http://schemas.microsoft.com/office/drawing/2016/5/9/chartex" xmlns:cx4="http://schemas.microsoft.com/office/drawing/2016/5/10/chartex" xmlns:cx5="http://schemas.microsoft.com/office/drawing/2016/5/11/chartex" xmlns:cx6="http://schemas.microsoft.com/office/drawing/2016/5/12/chartex" xmlns:cx7="http://schemas.microsoft.com/office/drawing/2016/5/13/chartex" xmlns:cx8="http://schemas.microsoft.com/office/drawing/2016/5/14/chartex" xmlns:mc="http://schemas.openxmlformats.org/markup-compatibility/2006" xmlns:aink="http://schemas.microsoft.com/office/drawing/2016/ink" xmlns:am3d="http://schemas.microsoft.com/office/drawing/2017/model3d" xmlns:o="urn:schemas-microsoft-com:office:office" xmlns:r="http://schemas.openxmlformats.org/officeDocument/2006/relationships" xmlns:m="http://schemas.openxmlformats.org/officeDocument/2006/math" xmlns:v="urn:schemas-microsoft-com:vml" xmlns:wp14="http://schemas.microsoft.com/office/word/2010/wordprocessingDrawing" xmlns:wp="http://schemas.openxmlformats.org/drawingml/2006/wordprocessingDrawing" xmlns:w10="urn:schemas-microsoft-com:office:word" xmlns:w="http://schemas.openxmlformats.org/wordprocessingml/2006/main" xmlns:w14="http://schemas.microsoft.com/office/word/2010/wordml" xmlns:w15="http://schemas.microsoft.com/office/word/2012/wordml" xmlns:w16cid="http://schemas.microsoft.com/office/word/2016/wordml/cid" xmlns:w16se="http://schemas.microsoft.com/office/word/2015/wordml/symex" xmlns:wpg="http://schemas.microsoft.com/office/word/2010/wordprocessingGroup" xmlns:wpi="http://schemas.microsoft.com/office/word/2010/wordprocessingInk" xmlns:wne="http://schemas.microsoft.com/office/word/2006/wordml" xmlns:wps="http://schemas.microsoft.com/office/word/2010/wordprocessingShape" mc:Ignorable="w14 w15 w16se w16cid wp14">
+  <w:p>
+    <w:pPr>
+      <w:pStyle w:val="Header"/>
+    </w:pPr>
+  </w:p>
+</w:hdr>
+</file>
+
+<file path=word/header3.xml><?xml version="1.0" encoding="utf-8"?>
+<w:hdr xmlns:wpc="http://schemas.microsoft.com/office/word/2010/wordprocessingCanvas" xmlns:cx="http://schemas.microsoft.com/office/drawing/2014/chartex" xmlns:cx1="http://schemas.microsoft.com/office/drawing/2015/9/8/chartex" xmlns:cx2="http://schemas.microsoft.com/office/drawing/2015/10/21/chartex" xmlns:cx3="http://schemas.microsoft.com/office/drawing/2016/5/9/chartex" xmlns:cx4="http://schemas.microsoft.com/office/drawing/2016/5/10/chartex" xmlns:cx5="http://schemas.microsoft.com/office/drawing/2016/5/11/chartex" xmlns:cx6="http://schemas.microsoft.com/office/drawing/2016/5/12/chartex" xmlns:cx7="http://schemas.microsoft.com/office/drawing/2016/5/13/chartex" xmlns:cx8="http://schemas.microsoft.com/office/drawing/2016/5/14/chartex" xmlns:mc="http://schemas.openxmlformats.org/markup-compatibility/2006" xmlns:aink="http://schemas.microsoft.com/office/drawing/2016/ink" xmlns:am3d="http://schemas.microsoft.com/office/drawing/2017/model3d" xmlns:o="urn:schemas-microsoft-com:office:office" xmlns:r="http://schemas.openxmlformats.org/officeDocument/2006/relationships" xmlns:m="http://schemas.openxmlformats.org/officeDocument/2006/math" xmlns:v="urn:schemas-microsoft-com:vml" xmlns:wp14="http://schemas.microsoft.com/office/word/2010/wordprocessingDrawing" xmlns:wp="http://schemas.openxmlformats.org/drawingml/2006/wordprocessingDrawing" xmlns:w10="urn:schemas-microsoft-com:office:word" xmlns:w="http://schemas.openxmlformats.org/wordprocessingml/2006/main" xmlns:w14="http://schemas.microsoft.com/office/word/2010/wordml" xmlns:w15="http://schemas.microsoft.com/office/word/2012/wordml" xmlns:w16cid="http://schemas.microsoft.com/office/word/2016/wordml/cid" xmlns:w16se="http://schemas.microsoft.com/office/word/2015/wordml/symex" xmlns:wpg="http://schemas.microsoft.com/office/word/2010/wordprocessingGroup" xmlns:wpi="http://schemas.microsoft.com/office/word/2010/wordprocessingInk" xmlns:wne="http://schemas.microsoft.com/office/word/2006/wordml" xmlns:wps="http://schemas.microsoft.com/office/word/2010/wordprocessingShape" mc:Ignorable="w14 w15 w16se w16cid wp14">
+  <w:p>
+    <w:pPr>
+      <w:pStyle w:val="Header"/>
+    </w:pPr>
+  </w:p>
+</w:hdr>
 </file>
 
 <file path=word/styles.xml><?xml version="1.0" encoding="utf-8"?>

</xml_diff>